<commit_message>
fix: add email and phone to contract export mapping
</commit_message>
<xml_diff>
--- a/public/templates/MAU_VIC_HDCTV.docx
+++ b/public/templates/MAU_VIC_HDCTV.docx
@@ -135,39 +135,67 @@
         <w:spacing w:before="126"/>
         <w:ind w:left="180" w:right="568" w:firstLine="90"/>
         <w:jc w:val="both"/>
-      </w:pPr>
-      <w:r>
+        <w:rPr>
+          <w:sz w:val="24"/>
+          <w:szCs w:val="24"/>
+        </w:rPr>
+      </w:pPr>
+      <w:r>
+        <w:rPr>
+          <w:sz w:val="24"/>
+          <w:szCs w:val="24"/>
+        </w:rPr>
         <w:t xml:space="preserve">Hợp đồng dịch vụ này </w:t>
       </w:r>
       <w:r>
         <w:rPr>
           <w:b/>
+          <w:sz w:val="24"/>
+          <w:szCs w:val="24"/>
         </w:rPr>
         <w:t xml:space="preserve">(“Hợp Đồng”) </w:t>
       </w:r>
       <w:r>
+        <w:rPr>
+          <w:sz w:val="24"/>
+          <w:szCs w:val="24"/>
+        </w:rPr>
         <w:t>được lập</w:t>
       </w:r>
       <w:r>
         <w:rPr>
           <w:spacing w:val="-9"/>
+          <w:sz w:val="24"/>
+          <w:szCs w:val="24"/>
         </w:rPr>
         <w:t xml:space="preserve"> </w:t>
       </w:r>
       <w:r>
+        <w:rPr>
+          <w:sz w:val="24"/>
+          <w:szCs w:val="24"/>
+        </w:rPr>
         <w:t>vào</w:t>
       </w:r>
       <w:r>
         <w:rPr>
           <w:spacing w:val="-3"/>
+          <w:sz w:val="24"/>
+          <w:szCs w:val="24"/>
         </w:rPr>
         <w:t xml:space="preserve"> </w:t>
       </w:r>
       <w:r>
+        <w:rPr>
+          <w:sz w:val="24"/>
+          <w:szCs w:val="24"/>
+        </w:rPr>
         <w:t>ngày</w:t>
       </w:r>
       <w:r>
         <w:rPr>
+          <w:sz w:val="24"/>
+          <w:szCs w:val="24"/>
           <w:lang w:val="en-US"/>
         </w:rPr>
         <w:t xml:space="preserve"> </w:t>
@@ -178,26 +206,28 @@
           <w:szCs w:val="24"/>
           <w:lang w:val="pt-BR"/>
         </w:rPr>
-        <w:t>{{ngay_bat_dau}</w:t>
-      </w:r>
-      <w:r>
-        <w:rPr>
-          <w:sz w:val="24"/>
-          <w:szCs w:val="24"/>
-          <w:lang w:val="pt-BR"/>
-        </w:rPr>
-        <w:t xml:space="preserve">} </w:t>
-      </w:r>
-      <w:r>
+        <w:t xml:space="preserve">{{ngay_bat_dau}} </w:t>
+      </w:r>
+      <w:r>
+        <w:rPr>
+          <w:sz w:val="24"/>
+          <w:szCs w:val="24"/>
+        </w:rPr>
         <w:t>bởi và giữa Các Bên</w:t>
       </w:r>
       <w:r>
         <w:rPr>
           <w:spacing w:val="-3"/>
+          <w:sz w:val="24"/>
+          <w:szCs w:val="24"/>
         </w:rPr>
         <w:t xml:space="preserve"> </w:t>
       </w:r>
       <w:r>
+        <w:rPr>
+          <w:sz w:val="24"/>
+          <w:szCs w:val="24"/>
+        </w:rPr>
         <w:t>sau:</w:t>
       </w:r>
     </w:p>
@@ -208,7 +238,8 @@
         <w:ind w:left="0"/>
         <w:jc w:val="both"/>
         <w:rPr>
-          <w:sz w:val="20"/>
+          <w:sz w:val="24"/>
+          <w:szCs w:val="24"/>
         </w:rPr>
       </w:pPr>
     </w:p>
@@ -217,8 +248,16 @@
         <w:pStyle w:val="Heading1"/>
         <w:spacing w:before="0"/>
         <w:jc w:val="both"/>
-      </w:pPr>
-      <w:r>
+        <w:rPr>
+          <w:sz w:val="24"/>
+          <w:szCs w:val="24"/>
+        </w:rPr>
+      </w:pPr>
+      <w:r>
+        <w:rPr>
+          <w:sz w:val="24"/>
+          <w:szCs w:val="24"/>
+        </w:rPr>
         <w:t>BÊN A:</w:t>
       </w:r>
     </w:p>
@@ -229,18 +268,24 @@
         <w:jc w:val="both"/>
         <w:rPr>
           <w:b/>
+          <w:sz w:val="24"/>
+          <w:szCs w:val="24"/>
           <w:lang w:val="en-US"/>
         </w:rPr>
       </w:pPr>
       <w:r>
         <w:rPr>
           <w:b/>
+          <w:sz w:val="24"/>
+          <w:szCs w:val="24"/>
         </w:rPr>
         <w:t>CÔNG TY TN</w:t>
       </w:r>
       <w:r>
         <w:rPr>
           <w:b/>
+          <w:sz w:val="24"/>
+          <w:szCs w:val="24"/>
           <w:lang w:val="en-US"/>
         </w:rPr>
         <w:t>HH VICTORY HOLDINGS VIỆT  NAM</w:t>
@@ -252,50 +297,90 @@
         <w:spacing w:before="127" w:line="360" w:lineRule="auto"/>
         <w:ind w:left="292" w:right="381"/>
         <w:jc w:val="both"/>
-      </w:pPr>
-      <w:r>
+        <w:rPr>
+          <w:sz w:val="24"/>
+          <w:szCs w:val="24"/>
+        </w:rPr>
+      </w:pPr>
+      <w:r>
+        <w:rPr>
+          <w:sz w:val="24"/>
+          <w:szCs w:val="24"/>
+        </w:rPr>
         <w:t xml:space="preserve">Giấy Chứng nhận đăng ký doanh nghiệp Số / Mã số doanh nghiệp: </w:t>
       </w:r>
       <w:r>
+        <w:rPr>
+          <w:sz w:val="24"/>
+          <w:szCs w:val="24"/>
+        </w:rPr>
         <w:t>0319324496</w:t>
       </w:r>
       <w:r>
+        <w:rPr>
+          <w:sz w:val="24"/>
+          <w:szCs w:val="24"/>
+        </w:rPr>
         <w:t xml:space="preserve"> do </w:t>
       </w:r>
       <w:r>
         <w:rPr>
+          <w:sz w:val="24"/>
+          <w:szCs w:val="24"/>
           <w:lang w:val="en-US"/>
         </w:rPr>
         <w:t>Phòng đăng ký kinh doanh - Sở Tài chính Thành phố Hồ Chí Minh</w:t>
       </w:r>
       <w:r>
+        <w:rPr>
+          <w:sz w:val="24"/>
+          <w:szCs w:val="24"/>
+        </w:rPr>
         <w:t xml:space="preserve"> cấp lần đầu ngày </w:t>
       </w:r>
       <w:r>
         <w:rPr>
+          <w:sz w:val="24"/>
+          <w:szCs w:val="24"/>
           <w:lang w:val="en-US"/>
         </w:rPr>
         <w:t>24</w:t>
       </w:r>
       <w:r>
+        <w:rPr>
+          <w:sz w:val="24"/>
+          <w:szCs w:val="24"/>
+        </w:rPr>
         <w:t>/</w:t>
       </w:r>
       <w:r>
         <w:rPr>
+          <w:sz w:val="24"/>
+          <w:szCs w:val="24"/>
           <w:lang w:val="en-US"/>
         </w:rPr>
         <w:t>12</w:t>
       </w:r>
       <w:r>
+        <w:rPr>
+          <w:sz w:val="24"/>
+          <w:szCs w:val="24"/>
+        </w:rPr>
         <w:t>/20</w:t>
       </w:r>
       <w:r>
         <w:rPr>
+          <w:sz w:val="24"/>
+          <w:szCs w:val="24"/>
           <w:lang w:val="en-US"/>
         </w:rPr>
         <w:t>2</w:t>
       </w:r>
       <w:r>
+        <w:rPr>
+          <w:sz w:val="24"/>
+          <w:szCs w:val="24"/>
+        </w:rPr>
         <w:t>5</w:t>
       </w:r>
     </w:p>
@@ -310,39 +395,67 @@
         <w:ind w:left="292" w:right="330"/>
         <w:jc w:val="both"/>
         <w:rPr>
+          <w:sz w:val="24"/>
+          <w:szCs w:val="24"/>
           <w:lang w:val="en-US"/>
         </w:rPr>
       </w:pPr>
       <w:r>
+        <w:rPr>
+          <w:sz w:val="24"/>
+          <w:szCs w:val="24"/>
+        </w:rPr>
         <w:t>Địa</w:t>
       </w:r>
       <w:r>
         <w:rPr>
           <w:spacing w:val="-1"/>
+          <w:sz w:val="24"/>
+          <w:szCs w:val="24"/>
         </w:rPr>
         <w:t xml:space="preserve"> </w:t>
       </w:r>
       <w:r>
+        <w:rPr>
+          <w:sz w:val="24"/>
+          <w:szCs w:val="24"/>
+        </w:rPr>
         <w:t>chỉ</w:t>
       </w:r>
       <w:r>
+        <w:rPr>
+          <w:sz w:val="24"/>
+          <w:szCs w:val="24"/>
+        </w:rPr>
         <w:tab/>
         <w:t xml:space="preserve">: </w:t>
       </w:r>
       <w:r>
+        <w:rPr>
+          <w:sz w:val="24"/>
+          <w:szCs w:val="24"/>
+        </w:rPr>
         <w:t>Số nhà 120, đường N3D (dự án khu đô thị Sài Gòn Bình An), Phường Bình Trưng,</w:t>
       </w:r>
       <w:r>
         <w:rPr>
+          <w:sz w:val="24"/>
+          <w:szCs w:val="24"/>
           <w:lang w:val="en-US"/>
         </w:rPr>
         <w:t xml:space="preserve"> </w:t>
       </w:r>
       <w:r>
+        <w:rPr>
+          <w:sz w:val="24"/>
+          <w:szCs w:val="24"/>
+        </w:rPr>
         <w:t>Tp.</w:t>
       </w:r>
       <w:r>
         <w:rPr>
+          <w:sz w:val="24"/>
+          <w:szCs w:val="24"/>
           <w:lang w:val="en-US"/>
         </w:rPr>
         <w:t>HCM</w:t>
@@ -358,27 +471,53 @@
         <w:spacing w:line="360" w:lineRule="auto"/>
         <w:ind w:left="292" w:right="1633"/>
         <w:jc w:val="both"/>
-      </w:pPr>
-      <w:r>
+        <w:rPr>
+          <w:sz w:val="24"/>
+          <w:szCs w:val="24"/>
+        </w:rPr>
+      </w:pPr>
+      <w:r>
+        <w:rPr>
+          <w:sz w:val="24"/>
+          <w:szCs w:val="24"/>
+        </w:rPr>
         <w:t>Điện</w:t>
       </w:r>
       <w:r>
         <w:rPr>
           <w:spacing w:val="-1"/>
+          <w:sz w:val="24"/>
+          <w:szCs w:val="24"/>
         </w:rPr>
         <w:t xml:space="preserve"> </w:t>
       </w:r>
       <w:r>
+        <w:rPr>
+          <w:sz w:val="24"/>
+          <w:szCs w:val="24"/>
+        </w:rPr>
         <w:t>thoại</w:t>
       </w:r>
       <w:r>
+        <w:rPr>
+          <w:sz w:val="24"/>
+          <w:szCs w:val="24"/>
+        </w:rPr>
         <w:tab/>
         <w:t xml:space="preserve">: </w:t>
       </w:r>
       <w:r>
+        <w:rPr>
+          <w:sz w:val="24"/>
+          <w:szCs w:val="24"/>
+        </w:rPr>
         <w:t>0937 610 689</w:t>
       </w:r>
       <w:r>
+        <w:rPr>
+          <w:sz w:val="24"/>
+          <w:szCs w:val="24"/>
+        </w:rPr>
         <w:tab/>
         <w:t>Fax :</w:t>
       </w:r>
@@ -392,26 +531,46 @@
         <w:spacing w:line="252" w:lineRule="exact"/>
         <w:ind w:left="292"/>
         <w:jc w:val="both"/>
-      </w:pPr>
-      <w:r>
+        <w:rPr>
+          <w:sz w:val="24"/>
+          <w:szCs w:val="24"/>
+        </w:rPr>
+      </w:pPr>
+      <w:r>
+        <w:rPr>
+          <w:sz w:val="24"/>
+          <w:szCs w:val="24"/>
+        </w:rPr>
         <w:t>Mã số</w:t>
       </w:r>
       <w:r>
         <w:rPr>
           <w:spacing w:val="-3"/>
+          <w:sz w:val="24"/>
+          <w:szCs w:val="24"/>
         </w:rPr>
         <w:t xml:space="preserve"> </w:t>
       </w:r>
       <w:r>
+        <w:rPr>
+          <w:sz w:val="24"/>
+          <w:szCs w:val="24"/>
+        </w:rPr>
         <w:t>thuế</w:t>
       </w:r>
       <w:r>
         <w:rPr>
+          <w:sz w:val="24"/>
+          <w:szCs w:val="24"/>
           <w:lang w:val="en-US"/>
         </w:rPr>
-        <w:t xml:space="preserve">         : </w:t>
-      </w:r>
-      <w:r>
+        <w:t xml:space="preserve">      : </w:t>
+      </w:r>
+      <w:r>
+        <w:rPr>
+          <w:sz w:val="24"/>
+          <w:szCs w:val="24"/>
+        </w:rPr>
         <w:t>0319324496</w:t>
       </w:r>
     </w:p>
@@ -424,35 +583,61 @@
         <w:spacing w:before="126"/>
         <w:ind w:left="292"/>
         <w:jc w:val="both"/>
-      </w:pPr>
-      <w:r>
+        <w:rPr>
+          <w:sz w:val="24"/>
+          <w:szCs w:val="24"/>
+        </w:rPr>
+      </w:pPr>
+      <w:r>
+        <w:rPr>
+          <w:sz w:val="24"/>
+          <w:szCs w:val="24"/>
+        </w:rPr>
         <w:t>Số</w:t>
       </w:r>
       <w:r>
         <w:rPr>
           <w:spacing w:val="-1"/>
+          <w:sz w:val="24"/>
+          <w:szCs w:val="24"/>
         </w:rPr>
         <w:t xml:space="preserve"> </w:t>
       </w:r>
       <w:r>
+        <w:rPr>
+          <w:sz w:val="24"/>
+          <w:szCs w:val="24"/>
+        </w:rPr>
         <w:t>tài</w:t>
       </w:r>
       <w:r>
         <w:rPr>
           <w:spacing w:val="1"/>
+          <w:sz w:val="24"/>
+          <w:szCs w:val="24"/>
         </w:rPr>
         <w:t xml:space="preserve"> </w:t>
       </w:r>
       <w:r>
+        <w:rPr>
+          <w:sz w:val="24"/>
+          <w:szCs w:val="24"/>
+        </w:rPr>
         <w:t>khoản</w:t>
       </w:r>
       <w:r>
+        <w:rPr>
+          <w:sz w:val="24"/>
+          <w:szCs w:val="24"/>
+        </w:rPr>
         <w:tab/>
         <w:t>:</w:t>
       </w:r>
       <w:r>
         <w:rPr>
           <w:spacing w:val="1"/>
+          <w:sz w:val="24"/>
+          <w:szCs w:val="24"/>
         </w:rPr>
         <w:t xml:space="preserve"> </w:t>
       </w:r>
@@ -466,11 +651,23 @@
         <w:spacing w:before="128" w:line="360" w:lineRule="auto"/>
         <w:ind w:left="292" w:right="1474"/>
         <w:jc w:val="both"/>
-      </w:pPr>
-      <w:r>
+        <w:rPr>
+          <w:sz w:val="24"/>
+          <w:szCs w:val="24"/>
+        </w:rPr>
+      </w:pPr>
+      <w:r>
+        <w:rPr>
+          <w:sz w:val="24"/>
+          <w:szCs w:val="24"/>
+        </w:rPr>
         <w:t>Tại</w:t>
       </w:r>
       <w:r>
+        <w:rPr>
+          <w:sz w:val="24"/>
+          <w:szCs w:val="24"/>
+        </w:rPr>
         <w:tab/>
         <w:t xml:space="preserve">: </w:t>
       </w:r>
@@ -486,34 +683,54 @@
         <w:jc w:val="both"/>
         <w:rPr>
           <w:b/>
+          <w:sz w:val="24"/>
+          <w:szCs w:val="24"/>
           <w:lang w:val="en-US"/>
         </w:rPr>
       </w:pPr>
       <w:r>
+        <w:rPr>
+          <w:sz w:val="24"/>
+          <w:szCs w:val="24"/>
+        </w:rPr>
         <w:t>Đại diện</w:t>
       </w:r>
       <w:r>
         <w:rPr>
           <w:spacing w:val="-1"/>
+          <w:sz w:val="24"/>
+          <w:szCs w:val="24"/>
         </w:rPr>
         <w:t xml:space="preserve"> </w:t>
       </w:r>
       <w:r>
+        <w:rPr>
+          <w:sz w:val="24"/>
+          <w:szCs w:val="24"/>
+        </w:rPr>
         <w:t>bởi</w:t>
       </w:r>
       <w:r>
+        <w:rPr>
+          <w:sz w:val="24"/>
+          <w:szCs w:val="24"/>
+        </w:rPr>
         <w:tab/>
         <w:t xml:space="preserve">: </w:t>
       </w:r>
       <w:r>
         <w:rPr>
           <w:b/>
+          <w:sz w:val="24"/>
+          <w:szCs w:val="24"/>
         </w:rPr>
         <w:t xml:space="preserve">Bà </w:t>
       </w:r>
       <w:r>
         <w:rPr>
           <w:b/>
+          <w:sz w:val="24"/>
+          <w:szCs w:val="24"/>
           <w:lang w:val="en-US"/>
         </w:rPr>
         <w:t>Mai Hoài Thương</w:t>
@@ -521,16 +738,24 @@
       <w:r>
         <w:rPr>
           <w:b/>
+          <w:sz w:val="24"/>
+          <w:szCs w:val="24"/>
         </w:rPr>
         <w:t xml:space="preserve">                      </w:t>
       </w:r>
       <w:r>
+        <w:rPr>
+          <w:sz w:val="24"/>
+          <w:szCs w:val="24"/>
+        </w:rPr>
         <w:t xml:space="preserve">Chức vụ: </w:t>
       </w:r>
       <w:r>
         <w:rPr>
           <w:b/>
           <w:bCs/>
+          <w:sz w:val="24"/>
+          <w:szCs w:val="24"/>
           <w:lang w:val="en-US"/>
         </w:rPr>
         <w:t>Tổng Giám đốc</w:t>
@@ -547,17 +772,31 @@
         <w:spacing w:line="360" w:lineRule="auto"/>
         <w:ind w:left="292" w:right="529"/>
         <w:jc w:val="both"/>
-      </w:pPr>
-      <w:r>
+        <w:rPr>
+          <w:sz w:val="24"/>
+          <w:szCs w:val="24"/>
+        </w:rPr>
+      </w:pPr>
+      <w:r>
+        <w:rPr>
+          <w:sz w:val="24"/>
+          <w:szCs w:val="24"/>
+        </w:rPr>
         <w:t>Số CMT</w:t>
       </w:r>
       <w:r>
+        <w:rPr>
+          <w:sz w:val="24"/>
+          <w:szCs w:val="24"/>
+        </w:rPr>
         <w:tab/>
         <w:t>:</w:t>
       </w:r>
       <w:r>
         <w:rPr>
           <w:spacing w:val="1"/>
+          <w:sz w:val="24"/>
+          <w:szCs w:val="24"/>
         </w:rPr>
         <w:t xml:space="preserve"> </w:t>
       </w:r>
@@ -569,60 +808,112 @@
         <w:t>044191000987</w:t>
       </w:r>
       <w:r>
+        <w:rPr>
+          <w:sz w:val="24"/>
+          <w:szCs w:val="24"/>
+        </w:rPr>
         <w:t xml:space="preserve">           </w:t>
       </w:r>
       <w:r>
+        <w:rPr>
+          <w:sz w:val="24"/>
+          <w:szCs w:val="24"/>
+        </w:rPr>
         <w:t>Cấp</w:t>
       </w:r>
       <w:r>
         <w:rPr>
           <w:spacing w:val="-1"/>
+          <w:sz w:val="24"/>
+          <w:szCs w:val="24"/>
         </w:rPr>
         <w:t xml:space="preserve"> </w:t>
       </w:r>
       <w:r>
+        <w:rPr>
+          <w:sz w:val="24"/>
+          <w:szCs w:val="24"/>
+        </w:rPr>
         <w:t>ngày</w:t>
       </w:r>
       <w:r>
+        <w:rPr>
+          <w:sz w:val="24"/>
+          <w:szCs w:val="24"/>
+        </w:rPr>
         <w:t xml:space="preserve">: </w:t>
       </w:r>
       <w:r>
+        <w:rPr>
+          <w:sz w:val="24"/>
+          <w:szCs w:val="24"/>
+        </w:rPr>
         <w:t>1</w:t>
       </w:r>
       <w:r>
         <w:rPr>
+          <w:sz w:val="24"/>
+          <w:szCs w:val="24"/>
           <w:lang w:val="en-US"/>
         </w:rPr>
         <w:t>8</w:t>
       </w:r>
       <w:r>
+        <w:rPr>
+          <w:sz w:val="24"/>
+          <w:szCs w:val="24"/>
+        </w:rPr>
         <w:t>/0</w:t>
       </w:r>
       <w:r>
         <w:rPr>
+          <w:sz w:val="24"/>
+          <w:szCs w:val="24"/>
           <w:lang w:val="en-US"/>
         </w:rPr>
         <w:t>8</w:t>
       </w:r>
       <w:r>
+        <w:rPr>
+          <w:sz w:val="24"/>
+          <w:szCs w:val="24"/>
+        </w:rPr>
         <w:t>/20</w:t>
       </w:r>
       <w:r>
         <w:rPr>
+          <w:sz w:val="24"/>
+          <w:szCs w:val="24"/>
           <w:lang w:val="en-US"/>
         </w:rPr>
         <w:t>17</w:t>
       </w:r>
       <w:r>
+        <w:rPr>
+          <w:sz w:val="24"/>
+          <w:szCs w:val="24"/>
+        </w:rPr>
         <w:t xml:space="preserve"> </w:t>
       </w:r>
       <w:r>
+        <w:rPr>
+          <w:sz w:val="24"/>
+          <w:szCs w:val="24"/>
+        </w:rPr>
         <w:t xml:space="preserve">        </w:t>
       </w:r>
       <w:r>
+        <w:rPr>
+          <w:sz w:val="24"/>
+          <w:szCs w:val="24"/>
+        </w:rPr>
         <w:t xml:space="preserve">Tại: </w:t>
       </w:r>
       <w:r>
+        <w:rPr>
+          <w:sz w:val="24"/>
+          <w:szCs w:val="24"/>
+        </w:rPr>
         <w:t>Cục Cảnh sát QLHC về TTXH</w:t>
       </w:r>
     </w:p>
@@ -637,11 +928,23 @@
         <w:spacing w:line="360" w:lineRule="auto"/>
         <w:ind w:left="292" w:right="529"/>
         <w:jc w:val="both"/>
-      </w:pPr>
-      <w:r>
+        <w:rPr>
+          <w:sz w:val="24"/>
+          <w:szCs w:val="24"/>
+        </w:rPr>
+      </w:pPr>
+      <w:r>
+        <w:rPr>
+          <w:sz w:val="24"/>
+          <w:szCs w:val="24"/>
+        </w:rPr>
         <w:t xml:space="preserve">Nơi đăng ký hộ khẩu thường trú: </w:t>
       </w:r>
       <w:r>
+        <w:rPr>
+          <w:sz w:val="24"/>
+          <w:szCs w:val="24"/>
+        </w:rPr>
         <w:t>36, đường 54 phường Thảo Điền quận Thủ Đức, TP HCM</w:t>
       </w:r>
     </w:p>
@@ -649,8 +952,16 @@
       <w:pPr>
         <w:pStyle w:val="Heading1"/>
         <w:jc w:val="both"/>
-      </w:pPr>
-      <w:r>
+        <w:rPr>
+          <w:sz w:val="24"/>
+          <w:szCs w:val="24"/>
+        </w:rPr>
+      </w:pPr>
+      <w:r>
+        <w:rPr>
+          <w:sz w:val="24"/>
+          <w:szCs w:val="24"/>
+        </w:rPr>
         <w:t>VÀ:</w:t>
       </w:r>
     </w:p>
@@ -663,12 +974,16 @@
         <w:ind w:left="292"/>
         <w:jc w:val="both"/>
         <w:rPr>
+          <w:sz w:val="24"/>
+          <w:szCs w:val="24"/>
           <w:lang w:val="en-US"/>
         </w:rPr>
       </w:pPr>
       <w:r>
         <w:rPr>
           <w:b/>
+          <w:sz w:val="24"/>
+          <w:szCs w:val="24"/>
         </w:rPr>
         <w:t>BÊN</w:t>
       </w:r>
@@ -676,18 +991,24 @@
         <w:rPr>
           <w:b/>
           <w:spacing w:val="-1"/>
+          <w:sz w:val="24"/>
+          <w:szCs w:val="24"/>
         </w:rPr>
         <w:t xml:space="preserve"> </w:t>
       </w:r>
       <w:r>
         <w:rPr>
           <w:b/>
+          <w:sz w:val="24"/>
+          <w:szCs w:val="24"/>
         </w:rPr>
         <w:t>B</w:t>
       </w:r>
       <w:r>
         <w:rPr>
           <w:b/>
+          <w:sz w:val="24"/>
+          <w:szCs w:val="24"/>
         </w:rPr>
         <w:tab/>
         <w:t>: Ông/Bà:</w:t>
@@ -696,6 +1017,8 @@
         <w:rPr>
           <w:b/>
           <w:spacing w:val="54"/>
+          <w:sz w:val="24"/>
+          <w:szCs w:val="24"/>
           <w:lang w:val="en-US"/>
         </w:rPr>
         <w:t xml:space="preserve"> </w:t>
@@ -718,16 +1041,24 @@
         <w:spacing w:before="126"/>
         <w:ind w:left="292"/>
         <w:jc w:val="both"/>
+        <w:rPr>
+          <w:sz w:val="24"/>
+          <w:szCs w:val="24"/>
+        </w:rPr>
       </w:pPr>
       <w:r>
         <w:rPr>
           <w:bCs/>
-        </w:rPr>
-        <w:t>Ngày sinh         :</w:t>
+          <w:sz w:val="24"/>
+          <w:szCs w:val="24"/>
+        </w:rPr>
+        <w:t>Ngày sinh        :</w:t>
       </w:r>
       <w:r>
         <w:rPr>
           <w:b/>
+          <w:sz w:val="24"/>
+          <w:szCs w:val="24"/>
         </w:rPr>
         <w:t xml:space="preserve"> </w:t>
       </w:r>
@@ -751,6 +1082,8 @@
         <w:ind w:left="292"/>
         <w:jc w:val="both"/>
         <w:rPr>
+          <w:sz w:val="24"/>
+          <w:szCs w:val="24"/>
           <w:lang w:val="en-US"/>
         </w:rPr>
       </w:pPr>
@@ -764,12 +1097,18 @@
         <w:t>Số CCCD</w:t>
       </w:r>
       <w:r>
+        <w:rPr>
+          <w:sz w:val="24"/>
+          <w:szCs w:val="24"/>
+        </w:rPr>
         <w:tab/>
         <w:t xml:space="preserve">: </w:t>
       </w:r>
       <w:r>
         <w:rPr>
           <w:spacing w:val="1"/>
+          <w:sz w:val="24"/>
+          <w:szCs w:val="24"/>
         </w:rPr>
         <w:t xml:space="preserve"> </w:t>
       </w:r>
@@ -782,18 +1121,32 @@
         <w:t>{{so_cccd}}</w:t>
       </w:r>
       <w:r>
+        <w:rPr>
+          <w:sz w:val="24"/>
+          <w:szCs w:val="24"/>
+        </w:rPr>
         <w:t xml:space="preserve">   </w:t>
       </w:r>
       <w:r>
+        <w:rPr>
+          <w:sz w:val="24"/>
+          <w:szCs w:val="24"/>
+        </w:rPr>
         <w:t>Cấp</w:t>
       </w:r>
       <w:r>
         <w:rPr>
           <w:spacing w:val="-4"/>
+          <w:sz w:val="24"/>
+          <w:szCs w:val="24"/>
         </w:rPr>
         <w:t xml:space="preserve"> </w:t>
       </w:r>
       <w:r>
+        <w:rPr>
+          <w:sz w:val="24"/>
+          <w:szCs w:val="24"/>
+        </w:rPr>
         <w:t>ngày:</w:t>
       </w:r>
       <w:r>
@@ -811,25 +1164,27 @@
           <w:sz w:val="24"/>
           <w:szCs w:val="24"/>
         </w:rPr>
+        <w:t xml:space="preserve"> {{ngay_cap}}</w:t>
+      </w:r>
+      <w:r>
+        <w:rPr>
+          <w:sz w:val="24"/>
+          <w:szCs w:val="24"/>
+        </w:rPr>
         <w:t xml:space="preserve"> </w:t>
       </w:r>
       <w:r>
         <w:rPr>
-          <w:rFonts w:eastAsia="Times"/>
-          <w:sz w:val="24"/>
-          <w:szCs w:val="24"/>
-        </w:rPr>
-        <w:t>{{ngay_cap}}</w:t>
-      </w:r>
-      <w:r>
-        <w:t xml:space="preserve"> </w:t>
-      </w:r>
-      <w:r>
+          <w:sz w:val="24"/>
+          <w:szCs w:val="24"/>
+        </w:rPr>
         <w:t>Tại:</w:t>
       </w:r>
       <w:r>
         <w:rPr>
           <w:spacing w:val="1"/>
+          <w:sz w:val="24"/>
+          <w:szCs w:val="24"/>
           <w:lang w:val="en-US"/>
         </w:rPr>
         <w:t xml:space="preserve"> </w:t>
@@ -849,6 +1204,10 @@
         <w:spacing w:before="129"/>
         <w:ind w:left="292"/>
         <w:jc w:val="both"/>
+        <w:rPr>
+          <w:sz w:val="24"/>
+          <w:szCs w:val="24"/>
+        </w:rPr>
       </w:pPr>
       <w:r>
         <w:rPr>
@@ -860,25 +1219,41 @@
         <w:t>HKTT</w:t>
       </w:r>
       <w:r>
+        <w:rPr>
+          <w:sz w:val="24"/>
+          <w:szCs w:val="24"/>
+        </w:rPr>
         <w:t xml:space="preserve">   </w:t>
       </w:r>
       <w:r>
         <w:rPr>
+          <w:sz w:val="24"/>
+          <w:szCs w:val="24"/>
           <w:lang w:val="en-US"/>
         </w:rPr>
         <w:tab/>
         <w:t xml:space="preserve">     </w:t>
       </w:r>
       <w:r>
+        <w:rPr>
+          <w:sz w:val="24"/>
+          <w:szCs w:val="24"/>
+        </w:rPr>
         <w:t>:</w:t>
       </w:r>
       <w:r>
         <w:rPr>
           <w:spacing w:val="-33"/>
+          <w:sz w:val="24"/>
+          <w:szCs w:val="24"/>
         </w:rPr>
         <w:t xml:space="preserve"> </w:t>
       </w:r>
       <w:r>
+        <w:rPr>
+          <w:sz w:val="24"/>
+          <w:szCs w:val="24"/>
+        </w:rPr>
         <w:t xml:space="preserve"> </w:t>
       </w:r>
       <w:r>
@@ -901,30 +1276,46 @@
         <w:ind w:left="292"/>
         <w:jc w:val="both"/>
         <w:rPr>
+          <w:sz w:val="24"/>
+          <w:szCs w:val="24"/>
           <w:lang w:val="en-US"/>
         </w:rPr>
       </w:pPr>
       <w:r>
+        <w:rPr>
+          <w:sz w:val="24"/>
+          <w:szCs w:val="24"/>
+        </w:rPr>
         <w:t>Email</w:t>
       </w:r>
       <w:r>
+        <w:rPr>
+          <w:sz w:val="24"/>
+          <w:szCs w:val="24"/>
+        </w:rPr>
         <w:tab/>
       </w:r>
       <w:r>
         <w:rPr>
           <w:spacing w:val="-1"/>
+          <w:sz w:val="24"/>
+          <w:szCs w:val="24"/>
         </w:rPr>
         <w:t>:</w:t>
       </w:r>
       <w:r>
         <w:rPr>
           <w:spacing w:val="-6"/>
+          <w:sz w:val="24"/>
+          <w:szCs w:val="24"/>
         </w:rPr>
         <w:t xml:space="preserve"> </w:t>
       </w:r>
       <w:r>
         <w:rPr>
           <w:spacing w:val="-6"/>
+          <w:sz w:val="24"/>
+          <w:szCs w:val="24"/>
           <w:lang w:val="en-US"/>
         </w:rPr>
         <w:t>{{email}}</w:t>
@@ -939,24 +1330,40 @@
         <w:spacing w:before="127"/>
         <w:ind w:left="292"/>
         <w:jc w:val="both"/>
-      </w:pPr>
-      <w:r>
-        <w:rPr>
+        <w:rPr>
+          <w:sz w:val="24"/>
+          <w:szCs w:val="24"/>
+        </w:rPr>
+      </w:pPr>
+      <w:r>
+        <w:rPr>
+          <w:sz w:val="24"/>
+          <w:szCs w:val="24"/>
           <w:lang w:val="en-US"/>
         </w:rPr>
         <w:t>Mã số thuế</w:t>
       </w:r>
       <w:r>
+        <w:rPr>
+          <w:sz w:val="24"/>
+          <w:szCs w:val="24"/>
+        </w:rPr>
         <w:tab/>
         <w:t>:</w:t>
       </w:r>
       <w:r>
         <w:rPr>
           <w:spacing w:val="1"/>
+          <w:sz w:val="24"/>
+          <w:szCs w:val="24"/>
         </w:rPr>
         <w:t xml:space="preserve"> </w:t>
       </w:r>
       <w:r>
+        <w:rPr>
+          <w:sz w:val="24"/>
+          <w:szCs w:val="24"/>
+        </w:rPr>
         <w:t>{{ma_so_thue}}</w:t>
       </w:r>
     </w:p>
@@ -970,81 +1377,93 @@
         <w:ind w:left="292"/>
         <w:jc w:val="both"/>
         <w:rPr>
+          <w:sz w:val="24"/>
+          <w:szCs w:val="24"/>
           <w:lang w:val="en-US"/>
         </w:rPr>
       </w:pPr>
       <w:r>
+        <w:rPr>
+          <w:sz w:val="24"/>
+          <w:szCs w:val="24"/>
+        </w:rPr>
         <w:t>Số</w:t>
       </w:r>
       <w:r>
         <w:rPr>
           <w:spacing w:val="-1"/>
+          <w:sz w:val="24"/>
+          <w:szCs w:val="24"/>
         </w:rPr>
         <w:t xml:space="preserve"> </w:t>
       </w:r>
       <w:r>
+        <w:rPr>
+          <w:sz w:val="24"/>
+          <w:szCs w:val="24"/>
+        </w:rPr>
         <w:t>tài</w:t>
       </w:r>
       <w:r>
         <w:rPr>
           <w:spacing w:val="1"/>
+          <w:sz w:val="24"/>
+          <w:szCs w:val="24"/>
         </w:rPr>
         <w:t xml:space="preserve"> </w:t>
       </w:r>
       <w:r>
+        <w:rPr>
+          <w:sz w:val="24"/>
+          <w:szCs w:val="24"/>
+        </w:rPr>
         <w:t>khoản</w:t>
       </w:r>
       <w:r>
+        <w:rPr>
+          <w:sz w:val="24"/>
+          <w:szCs w:val="24"/>
+        </w:rPr>
         <w:tab/>
         <w:t xml:space="preserve">: </w:t>
       </w:r>
       <w:r>
+        <w:rPr>
+          <w:sz w:val="24"/>
+          <w:szCs w:val="24"/>
+        </w:rPr>
         <w:t xml:space="preserve"> </w:t>
       </w:r>
       <w:r>
         <w:rPr>
+          <w:sz w:val="24"/>
+          <w:szCs w:val="24"/>
           <w:lang w:val="en-US"/>
         </w:rPr>
-        <w:t>{{</w:t>
-      </w:r>
-      <w:r>
-        <w:rPr>
+        <w:t>{{so_tk_ngan_hang}}</w:t>
+      </w:r>
+      <w:r>
+        <w:rPr>
+          <w:sz w:val="24"/>
+          <w:szCs w:val="24"/>
+        </w:rPr>
+        <w:t xml:space="preserve">   </w:t>
+      </w:r>
+      <w:r>
+        <w:rPr>
+          <w:sz w:val="24"/>
+          <w:szCs w:val="24"/>
+        </w:rPr>
+        <w:t>Tại:</w:t>
+      </w:r>
+      <w:r>
+        <w:rPr>
+          <w:spacing w:val="-2"/>
+          <w:sz w:val="24"/>
+          <w:szCs w:val="24"/>
           <w:lang w:val="en-US"/>
         </w:rPr>
-        <w:t>so_tk_ngan_hang</w:t>
-      </w:r>
-      <w:r>
-        <w:rPr>
-          <w:lang w:val="en-US"/>
-        </w:rPr>
-        <w:t>}}</w:t>
-      </w:r>
-      <w:r>
-        <w:t xml:space="preserve">   </w:t>
-      </w:r>
-      <w:r>
-        <w:t>Tại:</w:t>
-      </w:r>
-      <w:r>
-        <w:rPr>
-          <w:spacing w:val="-2"/>
-          <w:lang w:val="en-US"/>
-        </w:rPr>
-        <w:t xml:space="preserve"> {{</w:t>
-      </w:r>
-      <w:r>
-        <w:rPr>
-          <w:spacing w:val="-2"/>
-          <w:lang w:val="en-US"/>
-        </w:rPr>
-        <w:t>ten_ngan_hang_thu_huong</w:t>
-      </w:r>
-      <w:r>
-        <w:rPr>
-          <w:spacing w:val="-2"/>
-          <w:lang w:val="en-US"/>
-        </w:rPr>
-        <w:t>}}</w:t>
+        <w:t xml:space="preserve"> {{ten_ngan_hang_thu_huong}}</w:t>
       </w:r>
     </w:p>
     <w:p>
@@ -1055,6 +1474,7 @@
         <w:rPr>
           <w:b/>
           <w:sz w:val="24"/>
+          <w:szCs w:val="24"/>
           <w:lang w:val="en-GB"/>
         </w:rPr>
       </w:pPr>
@@ -1062,12 +1482,16 @@
         <w:rPr>
           <w:b/>
           <w:i/>
+          <w:sz w:val="24"/>
+          <w:szCs w:val="24"/>
         </w:rPr>
         <w:t>(</w:t>
       </w:r>
       <w:r>
         <w:rPr>
           <w:i/>
+          <w:sz w:val="24"/>
+          <w:szCs w:val="24"/>
         </w:rPr>
         <w:t>Bên A và Bên B được gọi chung là “</w:t>
       </w:r>
@@ -1075,12 +1499,16 @@
         <w:rPr>
           <w:b/>
           <w:i/>
+          <w:sz w:val="24"/>
+          <w:szCs w:val="24"/>
         </w:rPr>
         <w:t>Các Bên</w:t>
       </w:r>
       <w:r>
         <w:rPr>
           <w:i/>
+          <w:sz w:val="24"/>
+          <w:szCs w:val="24"/>
         </w:rPr>
         <w:t>” và gọi riêng là “</w:t>
       </w:r>
@@ -1088,12 +1516,16 @@
         <w:rPr>
           <w:b/>
           <w:i/>
+          <w:sz w:val="24"/>
+          <w:szCs w:val="24"/>
         </w:rPr>
         <w:t>Bên</w:t>
       </w:r>
       <w:r>
         <w:rPr>
           <w:i/>
+          <w:sz w:val="24"/>
+          <w:szCs w:val="24"/>
         </w:rPr>
         <w:t>”</w:t>
       </w:r>
@@ -1101,6 +1533,7 @@
         <w:rPr>
           <w:b/>
           <w:sz w:val="24"/>
+          <w:szCs w:val="24"/>
         </w:rPr>
         <w:t>)</w:t>
       </w:r>
@@ -1112,8 +1545,8 @@
         <w:jc w:val="both"/>
         <w:rPr>
           <w:b/>
-          <w:sz w:val="2"/>
-          <w:szCs w:val="2"/>
+          <w:sz w:val="24"/>
+          <w:szCs w:val="24"/>
           <w:lang w:val="en-GB"/>
         </w:rPr>
       </w:pPr>
@@ -1125,10 +1558,16 @@
         <w:ind w:left="292"/>
         <w:jc w:val="both"/>
         <w:rPr>
+          <w:sz w:val="24"/>
+          <w:szCs w:val="24"/>
           <w:lang w:val="en-GB"/>
         </w:rPr>
       </w:pPr>
       <w:r>
+        <w:rPr>
+          <w:sz w:val="24"/>
+          <w:szCs w:val="24"/>
+        </w:rPr>
         <w:t>Sau khi thảo luận, Các Bên đồng ý ký kết Hợp Đồng này với các điều khoản như sau:</w:t>
       </w:r>
     </w:p>
@@ -1138,22 +1577,34 @@
         <w:spacing w:before="60" w:after="60" w:line="360" w:lineRule="auto"/>
         <w:ind w:hanging="22"/>
         <w:jc w:val="both"/>
+        <w:rPr>
+          <w:sz w:val="24"/>
+          <w:szCs w:val="24"/>
+        </w:rPr>
       </w:pPr>
       <w:r>
         <w:rPr>
           <w:b w:val="0"/>
           <w:spacing w:val="-56"/>
+          <w:sz w:val="24"/>
+          <w:szCs w:val="24"/>
           <w:u w:val="thick"/>
         </w:rPr>
         <w:t xml:space="preserve"> </w:t>
       </w:r>
       <w:r>
         <w:rPr>
+          <w:sz w:val="24"/>
+          <w:szCs w:val="24"/>
           <w:u w:val="thick"/>
         </w:rPr>
         <w:t xml:space="preserve">ĐIỀU 1: </w:t>
       </w:r>
       <w:r>
+        <w:rPr>
+          <w:sz w:val="24"/>
+          <w:szCs w:val="24"/>
+        </w:rPr>
         <w:t>NỘI DUNG CÔNG VIỆC</w:t>
       </w:r>
     </w:p>
@@ -1163,8 +1614,16 @@
         <w:spacing w:before="60" w:after="60" w:line="360" w:lineRule="auto"/>
         <w:ind w:left="292"/>
         <w:jc w:val="both"/>
-      </w:pPr>
-      <w:r>
+        <w:rPr>
+          <w:sz w:val="24"/>
+          <w:szCs w:val="24"/>
+        </w:rPr>
+      </w:pPr>
+      <w:r>
+        <w:rPr>
+          <w:sz w:val="24"/>
+          <w:szCs w:val="24"/>
+        </w:rPr>
         <w:t>Trong phạm vi Hợp Đồng này, Bên B đồng ý:</w:t>
       </w:r>
     </w:p>
@@ -1177,17 +1636,31 @@
         </w:numPr>
         <w:spacing w:before="60" w:after="60" w:line="360" w:lineRule="auto"/>
         <w:ind w:left="720" w:right="367" w:hanging="428"/>
-      </w:pPr>
-      <w:r>
+        <w:rPr>
+          <w:sz w:val="24"/>
+          <w:szCs w:val="24"/>
+        </w:rPr>
+      </w:pPr>
+      <w:r>
+        <w:rPr>
+          <w:sz w:val="24"/>
+          <w:szCs w:val="24"/>
+        </w:rPr>
         <w:t>Tìm kiếm, chủ động tiếp xúc, giới thiệu và cung cấp cho các Khách Hàng thông tin về Dự Án và Nhà ở để Khách Hàng mua Nhà ở của Bên A trong giỏ hàng bên A cung cấp qua</w:t>
       </w:r>
       <w:r>
         <w:rPr>
           <w:spacing w:val="-10"/>
+          <w:sz w:val="24"/>
+          <w:szCs w:val="24"/>
         </w:rPr>
         <w:t xml:space="preserve"> </w:t>
       </w:r>
       <w:r>
+        <w:rPr>
+          <w:sz w:val="24"/>
+          <w:szCs w:val="24"/>
+        </w:rPr>
         <w:t>email.</w:t>
       </w:r>
     </w:p>
@@ -1203,36 +1676,61 @@
         </w:tabs>
         <w:spacing w:before="60" w:after="60" w:line="360" w:lineRule="auto"/>
         <w:ind w:left="720" w:hanging="428"/>
-      </w:pPr>
-      <w:r>
+        <w:rPr>
+          <w:sz w:val="24"/>
+          <w:szCs w:val="24"/>
+        </w:rPr>
+      </w:pPr>
+      <w:r>
+        <w:rPr>
+          <w:sz w:val="24"/>
+          <w:szCs w:val="24"/>
+        </w:rPr>
+        <w:lastRenderedPageBreak/>
         <w:t>Tư vấn và giải đáp các yêu cầu của Khách Hàng liên quan đến Thỏa thuận đặt cọc, Hợp đồng mua bán Nhà ở (sau đây gọi chu</w:t>
       </w:r>
       <w:r>
+        <w:rPr>
+          <w:sz w:val="24"/>
+          <w:szCs w:val="24"/>
+        </w:rPr>
         <w:t xml:space="preserve"> </w:t>
       </w:r>
       <w:r>
+        <w:rPr>
+          <w:sz w:val="24"/>
+          <w:szCs w:val="24"/>
+        </w:rPr>
         <w:t xml:space="preserve">ng là </w:t>
       </w:r>
       <w:r>
         <w:rPr>
           <w:b/>
+          <w:sz w:val="24"/>
+          <w:szCs w:val="24"/>
         </w:rPr>
         <w:t xml:space="preserve">“Hợp Đồng Giao Dịch”) </w:t>
       </w:r>
       <w:r>
-        <w:t xml:space="preserve">của Chủ đầu tư nhằm xúc tiến việc ký kết Hợp Đồng Giao Dịch giữa Chủ Đầu Tư và Khách Hàng, đồng thời, hỗ trợ Bên A/Chủ Đầu Tư giải quyết các vấn đề phát sinh </w:t>
-      </w:r>
-      <w:r>
-        <w:lastRenderedPageBreak/>
-        <w:t>trong qua trình thực hiện các Hợp Đồng Giao</w:t>
+        <w:rPr>
+          <w:sz w:val="24"/>
+          <w:szCs w:val="24"/>
+        </w:rPr>
+        <w:t>của Chủ đầu tư nhằm xúc tiến việc ký kết Hợp Đồng Giao Dịch giữa Chủ Đầu Tư và Khách Hàng, đồng thời, hỗ trợ Bên A/Chủ Đầu Tư giải quyết các vấn đề phát sinh trong qua trình thực hiện các Hợp Đồng Giao</w:t>
       </w:r>
       <w:r>
         <w:rPr>
           <w:spacing w:val="-11"/>
+          <w:sz w:val="24"/>
+          <w:szCs w:val="24"/>
         </w:rPr>
         <w:t xml:space="preserve"> </w:t>
       </w:r>
       <w:r>
+        <w:rPr>
+          <w:sz w:val="24"/>
+          <w:szCs w:val="24"/>
+        </w:rPr>
         <w:t>Dịch.</w:t>
       </w:r>
     </w:p>
@@ -1248,17 +1746,31 @@
         </w:tabs>
         <w:spacing w:before="60" w:after="60" w:line="360" w:lineRule="auto"/>
         <w:ind w:left="720" w:hanging="428"/>
-      </w:pPr>
-      <w:r>
+        <w:rPr>
+          <w:sz w:val="24"/>
+          <w:szCs w:val="24"/>
+        </w:rPr>
+      </w:pPr>
+      <w:r>
+        <w:rPr>
+          <w:sz w:val="24"/>
+          <w:szCs w:val="24"/>
+        </w:rPr>
         <w:t>Phối hợp với Bên A và/hoặc tự mình (tùy theo yêu cầu của Bên A) tổ chức chương trình tiếp thị về Dự Án và chương trình bán Nhà ở của Bên A theo các nội dung, thời gian, địa điểm do Bên A xây dựng/thông báo và báo cáo bằng văn bản gửi Bên A về các phản hồi của Khách Hàng và kết quả của các công việc liên quan đến các chương trình tiếp thị đã thực</w:t>
       </w:r>
       <w:r>
         <w:rPr>
           <w:spacing w:val="-11"/>
+          <w:sz w:val="24"/>
+          <w:szCs w:val="24"/>
         </w:rPr>
         <w:t xml:space="preserve"> </w:t>
       </w:r>
       <w:r>
+        <w:rPr>
+          <w:sz w:val="24"/>
+          <w:szCs w:val="24"/>
+        </w:rPr>
         <w:t>hiện.</w:t>
       </w:r>
     </w:p>
@@ -1274,13 +1786,23 @@
         </w:tabs>
         <w:spacing w:before="60" w:after="60" w:line="360" w:lineRule="auto"/>
         <w:ind w:left="720" w:right="330" w:hanging="428"/>
-      </w:pPr>
-      <w:r>
+        <w:rPr>
+          <w:sz w:val="24"/>
+          <w:szCs w:val="24"/>
+        </w:rPr>
+      </w:pPr>
+      <w:r>
+        <w:rPr>
+          <w:sz w:val="24"/>
+          <w:szCs w:val="24"/>
+        </w:rPr>
         <w:t>Các công việc liên quan khác theo quy định của Họp Đồng này và yêu cầu của Bên A. (Sau đây gọi chung là “</w:t>
       </w:r>
       <w:r>
         <w:rPr>
           <w:b/>
+          <w:sz w:val="24"/>
+          <w:szCs w:val="24"/>
         </w:rPr>
         <w:t>Dịch vụ môi</w:t>
       </w:r>
@@ -1288,16 +1810,24 @@
         <w:rPr>
           <w:b/>
           <w:spacing w:val="-1"/>
+          <w:sz w:val="24"/>
+          <w:szCs w:val="24"/>
         </w:rPr>
         <w:t xml:space="preserve"> </w:t>
       </w:r>
       <w:r>
         <w:rPr>
           <w:b/>
+          <w:sz w:val="24"/>
+          <w:szCs w:val="24"/>
         </w:rPr>
         <w:t>giới</w:t>
       </w:r>
       <w:r>
+        <w:rPr>
+          <w:sz w:val="24"/>
+          <w:szCs w:val="24"/>
+        </w:rPr>
         <w:t>”).</w:t>
       </w:r>
     </w:p>
@@ -1315,14 +1845,22 @@
         <w:ind w:left="720" w:hanging="428"/>
         <w:rPr>
           <w:b/>
-        </w:rPr>
-      </w:pPr>
-      <w:r>
+          <w:sz w:val="24"/>
+          <w:szCs w:val="24"/>
+        </w:rPr>
+      </w:pPr>
+      <w:r>
+        <w:rPr>
+          <w:sz w:val="24"/>
+          <w:szCs w:val="24"/>
+        </w:rPr>
         <w:t xml:space="preserve">Đổi lại việc Bên B tiếp thị, tìm kiếm và giới thiệu Khách Hàng theo Họp Đồng này, Bên A đồng ý sẽ trả cho Bên B một khoản thù lao như quy định tại Điều 2 dưới đây </w:t>
       </w:r>
       <w:r>
         <w:rPr>
           <w:b/>
+          <w:sz w:val="24"/>
+          <w:szCs w:val="24"/>
         </w:rPr>
         <w:t>(“Phí Dịch vụ môi</w:t>
       </w:r>
@@ -1330,12 +1868,16 @@
         <w:rPr>
           <w:b/>
           <w:spacing w:val="-11"/>
+          <w:sz w:val="24"/>
+          <w:szCs w:val="24"/>
         </w:rPr>
         <w:t xml:space="preserve"> </w:t>
       </w:r>
       <w:r>
         <w:rPr>
           <w:b/>
+          <w:sz w:val="24"/>
+          <w:szCs w:val="24"/>
         </w:rPr>
         <w:t>giới”).</w:t>
       </w:r>
@@ -1350,6 +1892,8 @@
         <w:ind w:left="720" w:firstLine="0"/>
         <w:rPr>
           <w:b/>
+          <w:sz w:val="24"/>
+          <w:szCs w:val="24"/>
         </w:rPr>
       </w:pPr>
     </w:p>
@@ -1358,22 +1902,34 @@
         <w:pStyle w:val="Heading1"/>
         <w:spacing w:before="60" w:after="60" w:line="360" w:lineRule="auto"/>
         <w:jc w:val="both"/>
+        <w:rPr>
+          <w:sz w:val="24"/>
+          <w:szCs w:val="24"/>
+        </w:rPr>
       </w:pPr>
       <w:r>
         <w:rPr>
           <w:b w:val="0"/>
           <w:spacing w:val="-56"/>
+          <w:sz w:val="24"/>
+          <w:szCs w:val="24"/>
           <w:u w:val="thick"/>
         </w:rPr>
         <w:t xml:space="preserve"> </w:t>
       </w:r>
       <w:r>
         <w:rPr>
+          <w:sz w:val="24"/>
+          <w:szCs w:val="24"/>
           <w:u w:val="thick"/>
         </w:rPr>
         <w:t>ĐIỀU 2:</w:t>
       </w:r>
       <w:r>
+        <w:rPr>
+          <w:sz w:val="24"/>
+          <w:szCs w:val="24"/>
+        </w:rPr>
         <w:t xml:space="preserve"> PHÍ DỊCH VỤ MÔI GIỚI</w:t>
       </w:r>
     </w:p>
@@ -1391,11 +1947,15 @@
         <w:ind w:left="720" w:right="0" w:hanging="429"/>
         <w:rPr>
           <w:b/>
+          <w:sz w:val="24"/>
+          <w:szCs w:val="24"/>
         </w:rPr>
       </w:pPr>
       <w:r>
         <w:rPr>
           <w:b/>
+          <w:sz w:val="24"/>
+          <w:szCs w:val="24"/>
         </w:rPr>
         <w:t>Phí Dịch vụ môi</w:t>
       </w:r>
@@ -1403,12 +1963,16 @@
         <w:rPr>
           <w:b/>
           <w:spacing w:val="-3"/>
+          <w:sz w:val="24"/>
+          <w:szCs w:val="24"/>
         </w:rPr>
         <w:t xml:space="preserve"> </w:t>
       </w:r>
       <w:r>
         <w:rPr>
           <w:b/>
+          <w:sz w:val="24"/>
+          <w:szCs w:val="24"/>
         </w:rPr>
         <w:t>giới:</w:t>
       </w:r>
@@ -1425,26 +1989,46 @@
         </w:tabs>
         <w:spacing w:before="60" w:after="60" w:line="360" w:lineRule="auto"/>
         <w:ind w:left="1080"/>
-      </w:pPr>
-      <w:r>
+        <w:rPr>
+          <w:sz w:val="24"/>
+          <w:szCs w:val="24"/>
+        </w:rPr>
+      </w:pPr>
+      <w:r>
+        <w:rPr>
+          <w:sz w:val="24"/>
+          <w:szCs w:val="24"/>
+        </w:rPr>
         <w:t xml:space="preserve">Phí Dịch vụ môi giới Bên B được hưởng khi Cộng Tác Thành Công: theo chính sách bên A tại từng thời điểm, được thể hiện chi tiết tại phụ lục </w:t>
       </w:r>
       <w:r>
         <w:rPr>
           <w:b/>
+          <w:sz w:val="24"/>
+          <w:szCs w:val="24"/>
         </w:rPr>
         <w:t>“Biên bản xác nhận thanh toán phí dịch vụ môi giới”</w:t>
       </w:r>
       <w:r>
+        <w:rPr>
+          <w:sz w:val="24"/>
+          <w:szCs w:val="24"/>
+        </w:rPr>
         <w:t>, các biên bản này là một phần không thể tách rời của hợp đồng</w:t>
       </w:r>
       <w:r>
         <w:rPr>
           <w:spacing w:val="-25"/>
+          <w:sz w:val="24"/>
+          <w:szCs w:val="24"/>
         </w:rPr>
         <w:t xml:space="preserve"> </w:t>
       </w:r>
       <w:r>
+        <w:rPr>
+          <w:sz w:val="24"/>
+          <w:szCs w:val="24"/>
+        </w:rPr>
         <w:t>này.</w:t>
       </w:r>
     </w:p>
@@ -1467,29 +2051,47 @@
         </w:rPr>
       </w:pPr>
       <w:r>
+        <w:rPr>
+          <w:sz w:val="24"/>
+          <w:szCs w:val="24"/>
+        </w:rPr>
         <w:t xml:space="preserve">Dịch vụ môi giới của Bên B được xem là </w:t>
       </w:r>
       <w:r>
         <w:rPr>
           <w:b/>
+          <w:sz w:val="24"/>
+          <w:szCs w:val="24"/>
         </w:rPr>
         <w:t xml:space="preserve">“Cộng Tác Thành Công” </w:t>
       </w:r>
       <w:r>
+        <w:rPr>
+          <w:sz w:val="24"/>
+          <w:szCs w:val="24"/>
+        </w:rPr>
         <w:t xml:space="preserve">khi đáp ứng đầy đủ </w:t>
       </w:r>
       <w:r>
         <w:rPr>
           <w:spacing w:val="-2"/>
+          <w:sz w:val="24"/>
+          <w:szCs w:val="24"/>
         </w:rPr>
         <w:t xml:space="preserve">các </w:t>
       </w:r>
       <w:r>
+        <w:rPr>
+          <w:sz w:val="24"/>
+          <w:szCs w:val="24"/>
+        </w:rPr>
         <w:t xml:space="preserve">điều kiện sau: (i) Hợp Đồng Giao Dịch đã được ký kết giữa Bên A/Chủ Đầu Tư với Khách Hàng; (ii) Khách Hàng đã thanh toán đầy đủ tiền mua Nhà ở đợt 01 theo đúng quy định tại Hợp đồng mua bán nhà ở được ký kết giữa Bên A/Chủ Đầu Tư với Khách Hàng </w:t>
       </w:r>
       <w:r>
         <w:rPr>
           <w:b/>
+          <w:sz w:val="24"/>
+          <w:szCs w:val="24"/>
         </w:rPr>
         <w:t xml:space="preserve">(“Hợp Đồng Mua Bán”) </w:t>
       </w:r>
@@ -1514,17 +2116,31 @@
         </w:tabs>
         <w:spacing w:before="60" w:after="60" w:line="360" w:lineRule="auto"/>
         <w:ind w:left="1080" w:right="363"/>
-      </w:pPr>
-      <w:r>
+        <w:rPr>
+          <w:sz w:val="24"/>
+          <w:szCs w:val="24"/>
+        </w:rPr>
+      </w:pPr>
+      <w:r>
+        <w:rPr>
+          <w:sz w:val="24"/>
+          <w:szCs w:val="24"/>
+        </w:rPr>
         <w:t>Để tránh hiểu nhầm, Các Bên thống nhất rằng Phí Dịch vụ môi giới sẽ không được áp dụng trong trường hợp Hợp Đồng Giao Dịch giữa Bên A/Chủ Đầu Tư và Khách Hàng được gia hạn và/hoặc ký</w:t>
       </w:r>
       <w:r>
         <w:rPr>
           <w:spacing w:val="-2"/>
+          <w:sz w:val="24"/>
+          <w:szCs w:val="24"/>
         </w:rPr>
         <w:t xml:space="preserve"> </w:t>
       </w:r>
       <w:r>
+        <w:rPr>
+          <w:sz w:val="24"/>
+          <w:szCs w:val="24"/>
+        </w:rPr>
         <w:t>mới.</w:t>
       </w:r>
     </w:p>
@@ -1542,11 +2158,15 @@
         <w:ind w:left="720" w:right="0" w:hanging="429"/>
         <w:rPr>
           <w:b/>
+          <w:sz w:val="24"/>
+          <w:szCs w:val="24"/>
         </w:rPr>
       </w:pPr>
       <w:r>
         <w:rPr>
           <w:b/>
+          <w:sz w:val="24"/>
+          <w:szCs w:val="24"/>
         </w:rPr>
         <w:t>Thanh toán Phí Dịch vụ môi giới:</w:t>
       </w:r>
@@ -1560,17 +2180,31 @@
         </w:numPr>
         <w:spacing w:before="60" w:after="60" w:line="360" w:lineRule="auto"/>
         <w:ind w:left="1080" w:right="367" w:hanging="337"/>
-      </w:pPr>
-      <w:r>
+        <w:rPr>
+          <w:sz w:val="24"/>
+          <w:szCs w:val="24"/>
+        </w:rPr>
+      </w:pPr>
+      <w:r>
+        <w:rPr>
+          <w:sz w:val="24"/>
+          <w:szCs w:val="24"/>
+        </w:rPr>
         <w:t>Hình thức thanh toán: Tiền mặt hoặc chuyển khoản sau khi bên A giữ lại 10% thuế TNCN, bên A sẽ cấp chứng từ khấu trừ thuế TNCN cho bên</w:t>
       </w:r>
       <w:r>
         <w:rPr>
           <w:spacing w:val="-11"/>
+          <w:sz w:val="24"/>
+          <w:szCs w:val="24"/>
         </w:rPr>
         <w:t xml:space="preserve"> </w:t>
       </w:r>
       <w:r>
+        <w:rPr>
+          <w:sz w:val="24"/>
+          <w:szCs w:val="24"/>
+        </w:rPr>
         <w:t>B.</w:t>
       </w:r>
     </w:p>
@@ -1583,17 +2217,31 @@
         </w:numPr>
         <w:spacing w:before="60" w:after="60" w:line="360" w:lineRule="auto"/>
         <w:ind w:left="1080" w:right="0" w:hanging="337"/>
-      </w:pPr>
-      <w:r>
+        <w:rPr>
+          <w:sz w:val="24"/>
+          <w:szCs w:val="24"/>
+        </w:rPr>
+      </w:pPr>
+      <w:r>
+        <w:rPr>
+          <w:sz w:val="24"/>
+          <w:szCs w:val="24"/>
+        </w:rPr>
         <w:t>Điều kiện và thời hạn thanh toán: Sau khi bên A nhận được thanh toán từ Chủ đầu</w:t>
       </w:r>
       <w:r>
         <w:rPr>
           <w:spacing w:val="-19"/>
+          <w:sz w:val="24"/>
+          <w:szCs w:val="24"/>
         </w:rPr>
         <w:t xml:space="preserve"> </w:t>
       </w:r>
       <w:r>
+        <w:rPr>
+          <w:sz w:val="24"/>
+          <w:szCs w:val="24"/>
+        </w:rPr>
         <w:t>tư.</w:t>
       </w:r>
     </w:p>
@@ -1611,11 +2259,15 @@
         <w:ind w:left="720" w:right="0" w:hanging="429"/>
         <w:rPr>
           <w:b/>
+          <w:sz w:val="24"/>
+          <w:szCs w:val="24"/>
         </w:rPr>
       </w:pPr>
       <w:r>
         <w:rPr>
           <w:b/>
+          <w:sz w:val="24"/>
+          <w:szCs w:val="24"/>
         </w:rPr>
         <w:t>Phí Dịch vụ môi giới được thanh toán là Đồng Việt Nam (VND).</w:t>
       </w:r>
@@ -1630,6 +2282,8 @@
         <w:ind w:left="720" w:right="0" w:firstLine="0"/>
         <w:rPr>
           <w:b/>
+          <w:sz w:val="24"/>
+          <w:szCs w:val="24"/>
         </w:rPr>
       </w:pPr>
     </w:p>
@@ -1638,22 +2292,34 @@
         <w:pStyle w:val="Heading1"/>
         <w:spacing w:before="60" w:after="60" w:line="360" w:lineRule="auto"/>
         <w:jc w:val="both"/>
+        <w:rPr>
+          <w:sz w:val="24"/>
+          <w:szCs w:val="24"/>
+        </w:rPr>
       </w:pPr>
       <w:r>
         <w:rPr>
           <w:b w:val="0"/>
           <w:spacing w:val="-56"/>
+          <w:sz w:val="24"/>
+          <w:szCs w:val="24"/>
           <w:u w:val="thick"/>
         </w:rPr>
         <w:t xml:space="preserve"> </w:t>
       </w:r>
       <w:r>
         <w:rPr>
+          <w:sz w:val="24"/>
+          <w:szCs w:val="24"/>
           <w:u w:val="thick"/>
         </w:rPr>
         <w:t>ĐIỀU 3:</w:t>
       </w:r>
       <w:r>
+        <w:rPr>
+          <w:sz w:val="24"/>
+          <w:szCs w:val="24"/>
+        </w:rPr>
         <w:t xml:space="preserve"> QUYỀN VÀ TRÁCH NHIỆM CỦA BÊN A</w:t>
       </w:r>
     </w:p>
@@ -1669,17 +2335,39 @@
         </w:tabs>
         <w:spacing w:before="60" w:after="60" w:line="360" w:lineRule="auto"/>
         <w:ind w:left="720" w:right="367" w:hanging="428"/>
-      </w:pPr>
-      <w:r>
-        <w:t>Bên A sẽ cung cấp các thông tin, văn bản, hình ảnh cần thiết liên quan đến Dự Án và chương trình bán Nhà ở cho Bên B để Bên B thực hiện công việc theo quy định tại Điều 1 Hợp Đồng</w:t>
+        <w:rPr>
+          <w:sz w:val="24"/>
+          <w:szCs w:val="24"/>
+        </w:rPr>
+      </w:pPr>
+      <w:r>
+        <w:rPr>
+          <w:sz w:val="24"/>
+          <w:szCs w:val="24"/>
+        </w:rPr>
+        <w:t xml:space="preserve">Bên A sẽ cung cấp các thông tin, văn bản, hình ảnh cần thiết liên quan đến Dự Án và chương trình </w:t>
+      </w:r>
+      <w:r>
+        <w:rPr>
+          <w:sz w:val="24"/>
+          <w:szCs w:val="24"/>
+        </w:rPr>
+        <w:lastRenderedPageBreak/>
+        <w:t>bán Nhà ở cho Bên B để Bên B thực hiện công việc theo quy định tại Điều 1 Hợp Đồng</w:t>
       </w:r>
       <w:r>
         <w:rPr>
           <w:spacing w:val="-12"/>
+          <w:sz w:val="24"/>
+          <w:szCs w:val="24"/>
         </w:rPr>
         <w:t xml:space="preserve"> </w:t>
       </w:r>
       <w:r>
+        <w:rPr>
+          <w:sz w:val="24"/>
+          <w:szCs w:val="24"/>
+        </w:rPr>
         <w:t>này.</w:t>
       </w:r>
     </w:p>
@@ -1695,17 +2383,31 @@
         </w:tabs>
         <w:spacing w:before="60" w:after="60" w:line="360" w:lineRule="auto"/>
         <w:ind w:left="720" w:right="0" w:hanging="428"/>
-      </w:pPr>
-      <w:r>
+        <w:rPr>
+          <w:sz w:val="24"/>
+          <w:szCs w:val="24"/>
+        </w:rPr>
+      </w:pPr>
+      <w:r>
+        <w:rPr>
+          <w:sz w:val="24"/>
+          <w:szCs w:val="24"/>
+        </w:rPr>
         <w:t>Bên A chịu trách nhiệm về tính chính xác của các thông tin, văn bản, hình ảnh đã cung cấp cho Bên</w:t>
       </w:r>
       <w:r>
         <w:rPr>
           <w:spacing w:val="-23"/>
+          <w:sz w:val="24"/>
+          <w:szCs w:val="24"/>
         </w:rPr>
         <w:t xml:space="preserve"> </w:t>
       </w:r>
       <w:r>
+        <w:rPr>
+          <w:sz w:val="24"/>
+          <w:szCs w:val="24"/>
+        </w:rPr>
         <w:t>B.</w:t>
       </w:r>
     </w:p>
@@ -1721,17 +2423,31 @@
         </w:tabs>
         <w:spacing w:before="60" w:after="60" w:line="360" w:lineRule="auto"/>
         <w:ind w:left="720" w:hanging="428"/>
-      </w:pPr>
-      <w:r>
+        <w:rPr>
+          <w:sz w:val="24"/>
+          <w:szCs w:val="24"/>
+        </w:rPr>
+      </w:pPr>
+      <w:r>
+        <w:rPr>
+          <w:sz w:val="24"/>
+          <w:szCs w:val="24"/>
+        </w:rPr>
         <w:t>Nếu có thay đổi thông tin về Dự Án và điều chỉnh nội dung của chương trình bán Nhà ở, Bên A sẽ thông báo kịp thời cho Bên B bằng văn bản trước khi áp</w:t>
       </w:r>
       <w:r>
         <w:rPr>
           <w:spacing w:val="-5"/>
+          <w:sz w:val="24"/>
+          <w:szCs w:val="24"/>
         </w:rPr>
         <w:t xml:space="preserve"> </w:t>
       </w:r>
       <w:r>
+        <w:rPr>
+          <w:sz w:val="24"/>
+          <w:szCs w:val="24"/>
+        </w:rPr>
         <w:t>dụng.</w:t>
       </w:r>
     </w:p>
@@ -1747,17 +2463,31 @@
         </w:tabs>
         <w:spacing w:before="60" w:after="60" w:line="360" w:lineRule="auto"/>
         <w:ind w:left="720" w:right="366" w:hanging="428"/>
-      </w:pPr>
-      <w:r>
+        <w:rPr>
+          <w:sz w:val="24"/>
+          <w:szCs w:val="24"/>
+        </w:rPr>
+      </w:pPr>
+      <w:r>
+        <w:rPr>
+          <w:sz w:val="24"/>
+          <w:szCs w:val="24"/>
+        </w:rPr>
         <w:t>Bên A/Chủ Đầu Tư có quyền từ chối ký Hợp Đồng Giao Dịch với bất cứ Khách Hàng nào do Bên B giới thiệu trong trường hợp phát sinh trùng lặp hoặc mâu</w:t>
       </w:r>
       <w:r>
         <w:rPr>
           <w:spacing w:val="-16"/>
+          <w:sz w:val="24"/>
+          <w:szCs w:val="24"/>
         </w:rPr>
         <w:t xml:space="preserve"> </w:t>
       </w:r>
       <w:r>
+        <w:rPr>
+          <w:sz w:val="24"/>
+          <w:szCs w:val="24"/>
+        </w:rPr>
         <w:t>thuẫn.</w:t>
       </w:r>
     </w:p>
@@ -1773,18 +2503,31 @@
         </w:tabs>
         <w:spacing w:before="60" w:after="60" w:line="360" w:lineRule="auto"/>
         <w:ind w:left="720" w:right="366" w:hanging="428"/>
-      </w:pPr>
-      <w:r>
-        <w:lastRenderedPageBreak/>
+        <w:rPr>
+          <w:sz w:val="24"/>
+          <w:szCs w:val="24"/>
+        </w:rPr>
+      </w:pPr>
+      <w:r>
+        <w:rPr>
+          <w:sz w:val="24"/>
+          <w:szCs w:val="24"/>
+        </w:rPr>
         <w:t>Bên A sẽ chịu trách nhiệm với Khách Hàng về các nội dung được quy định trong Hợp Đồng Giao Dịch mà Bên A/Chủ Đầu Tư đã ký kết với Khách</w:t>
       </w:r>
       <w:r>
         <w:rPr>
           <w:spacing w:val="1"/>
+          <w:sz w:val="24"/>
+          <w:szCs w:val="24"/>
         </w:rPr>
         <w:t xml:space="preserve"> </w:t>
       </w:r>
       <w:r>
+        <w:rPr>
+          <w:sz w:val="24"/>
+          <w:szCs w:val="24"/>
+        </w:rPr>
         <w:t>Hàng.</w:t>
       </w:r>
     </w:p>
@@ -1800,17 +2543,31 @@
         </w:tabs>
         <w:spacing w:before="60" w:after="60" w:line="360" w:lineRule="auto"/>
         <w:ind w:left="720" w:hanging="428"/>
-      </w:pPr>
-      <w:r>
+        <w:rPr>
+          <w:sz w:val="24"/>
+          <w:szCs w:val="24"/>
+        </w:rPr>
+      </w:pPr>
+      <w:r>
+        <w:rPr>
+          <w:sz w:val="24"/>
+          <w:szCs w:val="24"/>
+        </w:rPr>
         <w:t>Thanh toán Phí Dịch vụ môi giới cho Bên B đầy đủ và đúng hạn theo các điều kiện đã thỏa thuận ở Điều 2 của Hợp Đồng</w:t>
       </w:r>
       <w:r>
         <w:rPr>
           <w:spacing w:val="-1"/>
+          <w:sz w:val="24"/>
+          <w:szCs w:val="24"/>
         </w:rPr>
         <w:t xml:space="preserve"> </w:t>
       </w:r>
       <w:r>
+        <w:rPr>
+          <w:sz w:val="24"/>
+          <w:szCs w:val="24"/>
+        </w:rPr>
         <w:t>này.</w:t>
       </w:r>
     </w:p>
@@ -1826,8 +2583,16 @@
         </w:tabs>
         <w:spacing w:before="60" w:after="60" w:line="360" w:lineRule="auto"/>
         <w:ind w:left="720" w:right="366" w:hanging="428"/>
-      </w:pPr>
-      <w:r>
+        <w:rPr>
+          <w:sz w:val="24"/>
+          <w:szCs w:val="24"/>
+        </w:rPr>
+      </w:pPr>
+      <w:r>
+        <w:rPr>
+          <w:sz w:val="24"/>
+          <w:szCs w:val="24"/>
+        </w:rPr>
         <w:t>Bên A có quyền chỉ định bất kỳ bên thứ ba nào để giám sát, kiểm tra việc thực hiện, tuân thủ các cam kết của Bên B quy định tại hợp đồng này và các công việc khác liên quan (nếu cần thiết) mà không cần bất kỳ chấp thuận nào của Bên B.</w:t>
       </w:r>
     </w:p>
@@ -1843,17 +2608,31 @@
         </w:tabs>
         <w:spacing w:before="60" w:after="60" w:line="360" w:lineRule="auto"/>
         <w:ind w:left="720" w:right="0" w:hanging="428"/>
-      </w:pPr>
-      <w:r>
+        <w:rPr>
+          <w:sz w:val="24"/>
+          <w:szCs w:val="24"/>
+        </w:rPr>
+      </w:pPr>
+      <w:r>
+        <w:rPr>
+          <w:sz w:val="24"/>
+          <w:szCs w:val="24"/>
+        </w:rPr>
         <w:t>Các quyền, nghĩa vụ khác quy định tại Hợp Đồng này và quy định của pháp</w:t>
       </w:r>
       <w:r>
         <w:rPr>
           <w:spacing w:val="-17"/>
+          <w:sz w:val="24"/>
+          <w:szCs w:val="24"/>
         </w:rPr>
         <w:t xml:space="preserve"> </w:t>
       </w:r>
       <w:r>
+        <w:rPr>
+          <w:sz w:val="24"/>
+          <w:szCs w:val="24"/>
+        </w:rPr>
         <w:t>luật.</w:t>
       </w:r>
     </w:p>
@@ -1865,6 +2644,10 @@
         </w:tabs>
         <w:spacing w:before="60" w:after="60" w:line="360" w:lineRule="auto"/>
         <w:ind w:left="720" w:right="0" w:firstLine="0"/>
+        <w:rPr>
+          <w:sz w:val="24"/>
+          <w:szCs w:val="24"/>
+        </w:rPr>
       </w:pPr>
     </w:p>
     <w:p>
@@ -1872,22 +2655,34 @@
         <w:pStyle w:val="Heading1"/>
         <w:spacing w:before="60" w:after="60" w:line="360" w:lineRule="auto"/>
         <w:jc w:val="both"/>
+        <w:rPr>
+          <w:sz w:val="24"/>
+          <w:szCs w:val="24"/>
+        </w:rPr>
       </w:pPr>
       <w:r>
         <w:rPr>
           <w:b w:val="0"/>
           <w:spacing w:val="-56"/>
+          <w:sz w:val="24"/>
+          <w:szCs w:val="24"/>
           <w:u w:val="thick"/>
         </w:rPr>
         <w:t xml:space="preserve"> </w:t>
       </w:r>
       <w:r>
         <w:rPr>
+          <w:sz w:val="24"/>
+          <w:szCs w:val="24"/>
           <w:u w:val="thick"/>
         </w:rPr>
         <w:t>ĐIỀU 4:</w:t>
       </w:r>
       <w:r>
+        <w:rPr>
+          <w:sz w:val="24"/>
+          <w:szCs w:val="24"/>
+        </w:rPr>
         <w:t xml:space="preserve"> QUYỀN VÀ NGHĨA VỤ CỦA BÊN B</w:t>
       </w:r>
     </w:p>
@@ -1903,17 +2698,31 @@
         </w:tabs>
         <w:spacing w:before="60" w:after="60" w:line="360" w:lineRule="auto"/>
         <w:ind w:left="720" w:right="0" w:hanging="429"/>
-      </w:pPr>
-      <w:r>
+        <w:rPr>
+          <w:sz w:val="24"/>
+          <w:szCs w:val="24"/>
+        </w:rPr>
+      </w:pPr>
+      <w:r>
+        <w:rPr>
+          <w:sz w:val="24"/>
+          <w:szCs w:val="24"/>
+        </w:rPr>
         <w:t>Được hưởng Phí Dịch vụ môi giới theo quy định của Hợp Đồng</w:t>
       </w:r>
       <w:r>
         <w:rPr>
           <w:spacing w:val="-6"/>
+          <w:sz w:val="24"/>
+          <w:szCs w:val="24"/>
         </w:rPr>
         <w:t xml:space="preserve"> </w:t>
       </w:r>
       <w:r>
+        <w:rPr>
+          <w:sz w:val="24"/>
+          <w:szCs w:val="24"/>
+        </w:rPr>
         <w:t>này.</w:t>
       </w:r>
     </w:p>
@@ -1929,17 +2738,31 @@
         </w:tabs>
         <w:spacing w:before="60" w:after="60" w:line="360" w:lineRule="auto"/>
         <w:ind w:left="720" w:hanging="429"/>
-      </w:pPr>
-      <w:r>
+        <w:rPr>
+          <w:sz w:val="24"/>
+          <w:szCs w:val="24"/>
+        </w:rPr>
+      </w:pPr>
+      <w:r>
+        <w:rPr>
+          <w:sz w:val="24"/>
+          <w:szCs w:val="24"/>
+        </w:rPr>
         <w:t>Bên B có trách nhiệm tuân thủ tất cả những yêu cầu và chỉ dẫn của Bên A/bên thứ ba do Bên A chỉ định theo từng thời điểm trong quá trình thực hiện Dịch vụ môi giới theo điều khoản và điều kiện của Hợp Đồng này, bao gồm nhưng không giới hạn bởi các yêu cầu, chỉ dẫn, quy định về việc công bố thông tin và hoạt động Marketing, hoạt động bán hàng, Nội quy, quy định của Bên</w:t>
       </w:r>
       <w:r>
         <w:rPr>
           <w:spacing w:val="-8"/>
+          <w:sz w:val="24"/>
+          <w:szCs w:val="24"/>
         </w:rPr>
         <w:t xml:space="preserve"> </w:t>
       </w:r>
       <w:r>
+        <w:rPr>
+          <w:sz w:val="24"/>
+          <w:szCs w:val="24"/>
+        </w:rPr>
         <w:t>A.</w:t>
       </w:r>
     </w:p>
@@ -1955,17 +2778,31 @@
         </w:tabs>
         <w:spacing w:before="60" w:after="60" w:line="360" w:lineRule="auto"/>
         <w:ind w:left="720" w:hanging="429"/>
-      </w:pPr>
-      <w:r>
+        <w:rPr>
+          <w:sz w:val="24"/>
+          <w:szCs w:val="24"/>
+        </w:rPr>
+      </w:pPr>
+      <w:r>
+        <w:rPr>
+          <w:sz w:val="24"/>
+          <w:szCs w:val="24"/>
+        </w:rPr>
         <w:t>Bên B có nghĩa vụ thực hiện Dịch vụ môi giới theo quy định tại Điều 1 Hợp Đồng này bằng sự cẩn trọng, sự tận tụy và các kỹ năng chuyên nghiệp hoàn thành một cách nhanh nhất, hiệu quả nhất các yêu cầu và chỉ dẫn do Bên A/bên thứ ba do Bên A chỉ định đưa</w:t>
       </w:r>
       <w:r>
         <w:rPr>
           <w:spacing w:val="-5"/>
+          <w:sz w:val="24"/>
+          <w:szCs w:val="24"/>
         </w:rPr>
         <w:t xml:space="preserve"> </w:t>
       </w:r>
       <w:r>
+        <w:rPr>
+          <w:sz w:val="24"/>
+          <w:szCs w:val="24"/>
+        </w:rPr>
         <w:t>ra.</w:t>
       </w:r>
     </w:p>
@@ -1981,17 +2818,31 @@
         </w:tabs>
         <w:spacing w:before="60" w:after="60" w:line="360" w:lineRule="auto"/>
         <w:ind w:left="720" w:right="364" w:hanging="429"/>
-      </w:pPr>
-      <w:r>
+        <w:rPr>
+          <w:sz w:val="24"/>
+          <w:szCs w:val="24"/>
+        </w:rPr>
+      </w:pPr>
+      <w:r>
+        <w:rPr>
+          <w:sz w:val="24"/>
+          <w:szCs w:val="24"/>
+        </w:rPr>
         <w:t>Bên B có trách nhiệm tự tổ chức, đào tạo đội ngũ tư vấn cho Khách Hàng nhằm duy trì chất lượng dịch vụ ở mức cao nhất và chịu trách nhiệm chi trả lương, phụ cấp và các phúc lợi khác theo quy định của pháp luật cho đội ngũ này trong suốt thời gian thực hiện Dịch vụ môi giới theo Hợp Đồng này. Bên B sẽ thông báo cho Bên A biết về đội ngũ tiếp thị (bao gồm nhưng không hạn chế cộng tác viên hưởng lương toàn thời gian hay các cộng tác viên hưởng hoa hồng trên doanh số giới thiệu), bao gồm tên, chứng minh nhân dân và vai trò của mỗi cá nhân có liên quan và bất cứ sự thay đổi nào trong suốt thời hạn của Hợp Đồng</w:t>
       </w:r>
       <w:r>
         <w:rPr>
           <w:spacing w:val="-24"/>
+          <w:sz w:val="24"/>
+          <w:szCs w:val="24"/>
         </w:rPr>
         <w:t xml:space="preserve"> </w:t>
       </w:r>
       <w:r>
+        <w:rPr>
+          <w:sz w:val="24"/>
+          <w:szCs w:val="24"/>
+        </w:rPr>
         <w:t>này.</w:t>
       </w:r>
     </w:p>
@@ -2007,17 +2858,31 @@
         </w:tabs>
         <w:spacing w:before="60" w:after="60" w:line="360" w:lineRule="auto"/>
         <w:ind w:left="720" w:hanging="429"/>
-      </w:pPr>
-      <w:r>
+        <w:rPr>
+          <w:sz w:val="24"/>
+          <w:szCs w:val="24"/>
+        </w:rPr>
+      </w:pPr>
+      <w:r>
+        <w:rPr>
+          <w:sz w:val="24"/>
+          <w:szCs w:val="24"/>
+        </w:rPr>
         <w:t>Bên B tự chịu mọi chi phí quảng cáo, đi lại, giao dịch với Khách Hàng để thực hiện các công việc trong phạm vi Dịch vụ môi giới quy định tại Hợp Đồng</w:t>
       </w:r>
       <w:r>
         <w:rPr>
           <w:spacing w:val="-8"/>
+          <w:sz w:val="24"/>
+          <w:szCs w:val="24"/>
         </w:rPr>
         <w:t xml:space="preserve"> </w:t>
       </w:r>
       <w:r>
+        <w:rPr>
+          <w:sz w:val="24"/>
+          <w:szCs w:val="24"/>
+        </w:rPr>
         <w:t>này.</w:t>
       </w:r>
     </w:p>
@@ -2033,17 +2898,39 @@
         </w:tabs>
         <w:spacing w:before="60" w:after="60" w:line="360" w:lineRule="auto"/>
         <w:ind w:left="720" w:hanging="429"/>
-      </w:pPr>
-      <w:r>
-        <w:t>Bên B chịu trách nhiệm về sự tư vấn của mình với Khách Hàng. Để làm rõ, Bên A không chịu trách nhiệm đối với những hứa hẹn hay những cam kết mà Bên B đưa ra với Khách Hàng, trừ những thông tin được Bên A cung cấp chính thức bằng văn</w:t>
+        <w:rPr>
+          <w:sz w:val="24"/>
+          <w:szCs w:val="24"/>
+        </w:rPr>
+      </w:pPr>
+      <w:r>
+        <w:rPr>
+          <w:sz w:val="24"/>
+          <w:szCs w:val="24"/>
+        </w:rPr>
+        <w:t xml:space="preserve">Bên B chịu trách nhiệm về sự tư vấn của mình với Khách Hàng. Để làm rõ, Bên A không chịu trách </w:t>
+      </w:r>
+      <w:r>
+        <w:rPr>
+          <w:sz w:val="24"/>
+          <w:szCs w:val="24"/>
+        </w:rPr>
+        <w:lastRenderedPageBreak/>
+        <w:t>nhiệm đối với những hứa hẹn hay những cam kết mà Bên B đưa ra với Khách Hàng, trừ những thông tin được Bên A cung cấp chính thức bằng văn</w:t>
       </w:r>
       <w:r>
         <w:rPr>
           <w:spacing w:val="-6"/>
+          <w:sz w:val="24"/>
+          <w:szCs w:val="24"/>
         </w:rPr>
         <w:t xml:space="preserve"> </w:t>
       </w:r>
       <w:r>
+        <w:rPr>
+          <w:sz w:val="24"/>
+          <w:szCs w:val="24"/>
+        </w:rPr>
         <w:t>bản.</w:t>
       </w:r>
     </w:p>
@@ -2061,11 +2948,15 @@
         <w:ind w:left="720" w:hanging="429"/>
         <w:rPr>
           <w:spacing w:val="-2"/>
+          <w:sz w:val="24"/>
+          <w:szCs w:val="24"/>
         </w:rPr>
       </w:pPr>
       <w:r>
         <w:rPr>
           <w:spacing w:val="-2"/>
+          <w:sz w:val="24"/>
+          <w:szCs w:val="24"/>
         </w:rPr>
         <w:t>Bên B không được đứng tên ký kết bất kỳ văn bản nào với Khách Hàng và Bên B không được nhận trực tiếp từ Khách Hàng tiền mặt, USD, vàng hay bất cứ hình thức nào liên quan đến việc ký kết và thực hiện thỏa thuận nào khác có liên quan đến Dự Án, ngoại trừ trường hợp theo quy định tại Điều 4.13 của Hợp Đồng này.</w:t>
       </w:r>
@@ -2082,17 +2973,31 @@
         </w:tabs>
         <w:spacing w:before="60" w:after="60" w:line="360" w:lineRule="auto"/>
         <w:ind w:left="720" w:hanging="429"/>
-      </w:pPr>
-      <w:r>
+        <w:rPr>
+          <w:sz w:val="24"/>
+          <w:szCs w:val="24"/>
+        </w:rPr>
+      </w:pPr>
+      <w:r>
+        <w:rPr>
+          <w:sz w:val="24"/>
+          <w:szCs w:val="24"/>
+        </w:rPr>
         <w:t>Bên B đồng ý để Bên A khấu trừ từ Phí Dịch vụ môi giới khoản thuế thu nhập cá nhân mà Bên B phải nộp theo quy định của pháp</w:t>
       </w:r>
       <w:r>
         <w:rPr>
           <w:spacing w:val="-1"/>
+          <w:sz w:val="24"/>
+          <w:szCs w:val="24"/>
         </w:rPr>
         <w:t xml:space="preserve"> </w:t>
       </w:r>
       <w:r>
+        <w:rPr>
+          <w:sz w:val="24"/>
+          <w:szCs w:val="24"/>
+        </w:rPr>
         <w:t>luật.</w:t>
       </w:r>
     </w:p>
@@ -2108,21 +3013,31 @@
         </w:tabs>
         <w:spacing w:before="60" w:after="60" w:line="360" w:lineRule="auto"/>
         <w:ind w:left="720" w:hanging="429"/>
-      </w:pPr>
-      <w:r>
-        <w:t xml:space="preserve">Bên B chỉ được phép sử dụng các tài liệu do Bên A/bên thứ ba do Bên A chỉ định cung cấp cho duy nhất mục đích thực hiện Dịch vụ môi giới viên được quy định tại Họp Đồng này và/hoặc các tài liệu do Bên B biên soạn sau khi đã được Bên A đồng ý phê duyệt cả về nội dung và hình thức. Tài liệu bao gồm từ ngữ, hình ảnh, âm thanh, video hoặc bất kỳ hình thức nào khác (nếu cỏ). Trường hợp Bên B vi phạm quy định tại Điều </w:t>
-      </w:r>
-      <w:r>
-        <w:lastRenderedPageBreak/>
-        <w:t>này, Bên B sẽ bị phạt và bồi thường thiệt hại theo quy định tại Phụ Lục 01 và các điều khoản khác tại Hợp Đồng</w:t>
+        <w:rPr>
+          <w:sz w:val="24"/>
+          <w:szCs w:val="24"/>
+        </w:rPr>
+      </w:pPr>
+      <w:r>
+        <w:rPr>
+          <w:sz w:val="24"/>
+          <w:szCs w:val="24"/>
+        </w:rPr>
+        <w:t>Bên B chỉ được phép sử dụng các tài liệu do Bên A/bên thứ ba do Bên A chỉ định cung cấp cho duy nhất mục đích thực hiện Dịch vụ môi giới viên được quy định tại Họp Đồng này và/hoặc các tài liệu do Bên B biên soạn sau khi đã được Bên A đồng ý phê duyệt cả về nội dung và hình thức. Tài liệu bao gồm từ ngữ, hình ảnh, âm thanh, video hoặc bất kỳ hình thức nào khác (nếu cỏ). Trường hợp Bên B vi phạm quy định tại Điều này, Bên B sẽ bị phạt và bồi thường thiệt hại theo quy định tại Phụ Lục 01 và các điều khoản khác tại Hợp Đồng</w:t>
       </w:r>
       <w:r>
         <w:rPr>
           <w:spacing w:val="-1"/>
+          <w:sz w:val="24"/>
+          <w:szCs w:val="24"/>
         </w:rPr>
         <w:t xml:space="preserve"> </w:t>
       </w:r>
       <w:r>
+        <w:rPr>
+          <w:sz w:val="24"/>
+          <w:szCs w:val="24"/>
+        </w:rPr>
         <w:t>này.</w:t>
       </w:r>
     </w:p>
@@ -2140,11 +3055,15 @@
         <w:ind w:left="720" w:hanging="429"/>
         <w:rPr>
           <w:spacing w:val="-2"/>
+          <w:sz w:val="24"/>
+          <w:szCs w:val="24"/>
         </w:rPr>
       </w:pPr>
       <w:r>
         <w:rPr>
           <w:spacing w:val="-2"/>
+          <w:sz w:val="24"/>
+          <w:szCs w:val="24"/>
         </w:rPr>
         <w:t>Bên B phải chi trả cho Bên A các khoản tiền phạt, tiền bồi thường trong trường hợp vi phạm theo quy định tại Hợp Đồng này và bồi thường toàn bộ thiệt hại cho Bên A đối với các khiếu nại, kiện tụng, mất mát và thiệt hại mà A có thể gánh chịu hoặc chịu trách nhiệm do bất kỳ hành động, hoặc bỏ sót công việc nào của Bên B hoặc do các cộng tác viên của Bên B gây ra trong quá trình thực hiện Dịch vụ môi giới theo Hợp Đồng này.</w:t>
       </w:r>
@@ -2163,18 +3082,30 @@
         <w:ind w:left="720" w:hanging="429"/>
         <w:rPr>
           <w:spacing w:val="-2"/>
-        </w:rPr>
-      </w:pPr>
-      <w:r>
+          <w:sz w:val="24"/>
+          <w:szCs w:val="24"/>
+        </w:rPr>
+      </w:pPr>
+      <w:r>
+        <w:rPr>
+          <w:sz w:val="24"/>
+          <w:szCs w:val="24"/>
+        </w:rPr>
         <w:t>Ngoài phạm vi Dịch vụ môi giới quy định theo Hợp Đồng này, Bên B phải trao đổi, bàn bạc và tùy thuộc vào sự đồng ý trước của Bên A, trước khi tiến hành bất cứ hành động nào khác liên quan đến Dự Án và chương trình bán Nhà ở của Bên</w:t>
       </w:r>
       <w:r>
         <w:rPr>
           <w:spacing w:val="-3"/>
+          <w:sz w:val="24"/>
+          <w:szCs w:val="24"/>
         </w:rPr>
         <w:t xml:space="preserve"> </w:t>
       </w:r>
       <w:r>
+        <w:rPr>
+          <w:sz w:val="24"/>
+          <w:szCs w:val="24"/>
+        </w:rPr>
         <w:t>A.</w:t>
       </w:r>
     </w:p>
@@ -2190,17 +3121,31 @@
         </w:tabs>
         <w:spacing w:before="60" w:after="60" w:line="360" w:lineRule="auto"/>
         <w:ind w:left="720" w:hanging="429"/>
-      </w:pPr>
-      <w:r>
+        <w:rPr>
+          <w:sz w:val="24"/>
+          <w:szCs w:val="24"/>
+        </w:rPr>
+      </w:pPr>
+      <w:r>
+        <w:rPr>
+          <w:sz w:val="24"/>
+          <w:szCs w:val="24"/>
+        </w:rPr>
         <w:t>Bên B có nghĩa vụ cung cấp cho Bên A mã số thuế và các hồ sơ, giấy tờ khác để Bên A tiến hành nộp thay khoản thuế thu nhập cá nhân cho Bên B. Trường hợp vi phạm, Bên B chịu toàn bộ trách nhiệm và phải thanh toán toàn bộ các khoản tiền phạt, tiền vi phạm theo yêu cầu/quyết định của Cơ quan có thẩm</w:t>
       </w:r>
       <w:r>
         <w:rPr>
           <w:spacing w:val="-24"/>
+          <w:sz w:val="24"/>
+          <w:szCs w:val="24"/>
         </w:rPr>
         <w:t xml:space="preserve"> </w:t>
       </w:r>
       <w:r>
+        <w:rPr>
+          <w:sz w:val="24"/>
+          <w:szCs w:val="24"/>
+        </w:rPr>
         <w:t>quyền.</w:t>
       </w:r>
     </w:p>
@@ -2218,12 +3163,16 @@
         <w:ind w:left="720" w:hanging="429"/>
         <w:rPr>
           <w:spacing w:val="-2"/>
+          <w:sz w:val="24"/>
+          <w:szCs w:val="24"/>
         </w:rPr>
       </w:pPr>
       <w:bookmarkStart w:id="0" w:name="_Hlk168990101"/>
       <w:r>
         <w:rPr>
           <w:spacing w:val="-2"/>
+          <w:sz w:val="24"/>
+          <w:szCs w:val="24"/>
         </w:rPr>
         <w:t>Trường hợp có căn cứ cho thấy Bên B có dấu hiệu, hành vi không tuân thủ quy định tại Điều 4.13 nêu trên và/hoặc có hành vi gian lận, lợi dụng việc cộng tác viên để gây thiệt hại cho Khách Hàng và/hoặc gây ảnh hưởng xấu đến hình ảnh, thương hiệu, uy tín của Bên A, thì để đảm bảo uy tín của Bên A/Chủ Đầu Tư, ngoài việc áp dụng các chế tài theo quy định của Hợp Đồng này, Bên A trên cơ sở khiếu nại của Khách Hàng được quyền trích từ Tiền Đặt Cọc và/hoặc khấu trừ từ Phí Dịch vụ môi giới để hoàn trả cho Khách Hàng số tiền mà Khách Hàng nộp cho Bên B hoặc/và thanh toán các thiệt hại của Khách Hàng phát sinh do việc vi phạm của Bên B. Ngoài ra trong trường hợp cần thiết, Bên A sẽ chuyển vụ việc lên cơ quan Nhà nước có thẩm quyền để điều tra xử lý việc vi phạm của Bên B (bao gồm cả các cộng tác viên của Bên B). Bên B tại đây đồng ý và ủy quyền cho Bên A được thực hiện việc trích Tiền Đặt Cọc và Phí Dịch vụ môi giới để trả cho Khách Hàng thay cho Bên B.</w:t>
       </w:r>
@@ -2242,12 +3191,17 @@
         <w:ind w:left="720" w:hanging="429"/>
         <w:rPr>
           <w:spacing w:val="-2"/>
+          <w:sz w:val="24"/>
+          <w:szCs w:val="24"/>
         </w:rPr>
       </w:pPr>
       <w:r>
         <w:rPr>
           <w:spacing w:val="-2"/>
-        </w:rPr>
+          <w:sz w:val="24"/>
+          <w:szCs w:val="24"/>
+        </w:rPr>
+        <w:lastRenderedPageBreak/>
         <w:t>Các quyền, nghĩa vụ khác quy định tại Hợp Đồng này và quy định của pháp luật.</w:t>
       </w:r>
       <w:bookmarkEnd w:id="0"/>
@@ -2262,6 +3216,8 @@
         <w:ind w:left="720" w:firstLine="0"/>
         <w:rPr>
           <w:spacing w:val="-2"/>
+          <w:sz w:val="24"/>
+          <w:szCs w:val="24"/>
         </w:rPr>
       </w:pPr>
     </w:p>
@@ -2270,14 +3226,24 @@
         <w:pStyle w:val="Heading1"/>
         <w:spacing w:before="60" w:after="60" w:line="360" w:lineRule="auto"/>
         <w:jc w:val="both"/>
-      </w:pPr>
-      <w:r>
-        <w:rPr>
+        <w:rPr>
+          <w:sz w:val="24"/>
+          <w:szCs w:val="24"/>
+        </w:rPr>
+      </w:pPr>
+      <w:r>
+        <w:rPr>
+          <w:sz w:val="24"/>
+          <w:szCs w:val="24"/>
           <w:u w:val="thick"/>
         </w:rPr>
         <w:t>ĐIỀU 5:</w:t>
       </w:r>
       <w:r>
+        <w:rPr>
+          <w:sz w:val="24"/>
+          <w:szCs w:val="24"/>
+        </w:rPr>
         <w:t xml:space="preserve"> VI PHẠM HỢP ĐỒNG</w:t>
       </w:r>
     </w:p>
@@ -2290,8 +3256,16 @@
         </w:numPr>
         <w:spacing w:before="60" w:after="60" w:line="360" w:lineRule="auto"/>
         <w:ind w:left="270" w:right="420" w:firstLine="21"/>
-      </w:pPr>
-      <w:r>
+        <w:rPr>
+          <w:sz w:val="24"/>
+          <w:szCs w:val="24"/>
+        </w:rPr>
+      </w:pPr>
+      <w:r>
+        <w:rPr>
+          <w:sz w:val="24"/>
+          <w:szCs w:val="24"/>
+        </w:rPr>
         <w:t>Bên B sẽ bị coi là vi pham Hợp Đồng này nếu Bên B và/hoặc bất kỳ cộng tác viên của Bên B không thực hiện hoặc thực hiện không đúng, không đầy đủ hoặc chậm thực hiện bất kỳ nghĩa vụ nào quy định trong Hợp Đồng này. Trong trường hợp này, Bên A có quyền (nhưng không có nghĩa vụ) áp dụng một và/hoặc các biện pháp sau đây:</w:t>
       </w:r>
     </w:p>
@@ -2308,17 +3282,31 @@
         <w:spacing w:before="60" w:after="60" w:line="360" w:lineRule="auto"/>
         <w:ind w:right="0"/>
         <w:jc w:val="both"/>
-      </w:pPr>
-      <w:r>
+        <w:rPr>
+          <w:sz w:val="24"/>
+          <w:szCs w:val="24"/>
+        </w:rPr>
+      </w:pPr>
+      <w:r>
+        <w:rPr>
+          <w:sz w:val="24"/>
+          <w:szCs w:val="24"/>
+        </w:rPr>
         <w:t>Yêu cầu Bên B khắc phục vi phạm bằng chi phí và phí tổn của Bên B;</w:t>
       </w:r>
       <w:r>
         <w:rPr>
           <w:spacing w:val="-5"/>
+          <w:sz w:val="24"/>
+          <w:szCs w:val="24"/>
         </w:rPr>
         <w:t xml:space="preserve"> </w:t>
       </w:r>
       <w:r>
+        <w:rPr>
+          <w:sz w:val="24"/>
+          <w:szCs w:val="24"/>
+        </w:rPr>
         <w:t>và/hoặc</w:t>
       </w:r>
     </w:p>
@@ -2335,17 +3323,31 @@
         <w:spacing w:before="60" w:after="60" w:line="360" w:lineRule="auto"/>
         <w:ind w:right="366" w:hanging="538"/>
         <w:jc w:val="both"/>
-      </w:pPr>
-      <w:r>
+        <w:rPr>
+          <w:sz w:val="24"/>
+          <w:szCs w:val="24"/>
+        </w:rPr>
+      </w:pPr>
+      <w:r>
+        <w:rPr>
+          <w:sz w:val="24"/>
+          <w:szCs w:val="24"/>
+        </w:rPr>
         <w:t>Áp dụng biện pháp phạt vi phạm theo quy định tại Phụ Lục 01 của Hợp Đồng này. Đối với các hành vi vi phạm chưa được quy định tại Phụ Lục 01, thì mức phạt với mỗi hành vi vi phạm là 100.000.000 đồng/lần;</w:t>
       </w:r>
       <w:r>
         <w:rPr>
           <w:spacing w:val="-3"/>
+          <w:sz w:val="24"/>
+          <w:szCs w:val="24"/>
         </w:rPr>
         <w:t xml:space="preserve"> </w:t>
       </w:r>
       <w:r>
+        <w:rPr>
+          <w:sz w:val="24"/>
+          <w:szCs w:val="24"/>
+        </w:rPr>
         <w:t>và/hoặc</w:t>
       </w:r>
     </w:p>
@@ -2362,17 +3364,31 @@
         <w:spacing w:before="60" w:after="60" w:line="360" w:lineRule="auto"/>
         <w:ind w:right="0" w:hanging="599"/>
         <w:jc w:val="both"/>
-      </w:pPr>
-      <w:r>
+        <w:rPr>
+          <w:sz w:val="24"/>
+          <w:szCs w:val="24"/>
+        </w:rPr>
+      </w:pPr>
+      <w:r>
+        <w:rPr>
+          <w:sz w:val="24"/>
+          <w:szCs w:val="24"/>
+        </w:rPr>
         <w:t>Yêu cầu Bên B bồi thường toàn bộ thiệt hại phát sinh;</w:t>
       </w:r>
       <w:r>
         <w:rPr>
           <w:spacing w:val="-7"/>
+          <w:sz w:val="24"/>
+          <w:szCs w:val="24"/>
         </w:rPr>
         <w:t xml:space="preserve"> </w:t>
       </w:r>
       <w:r>
+        <w:rPr>
+          <w:sz w:val="24"/>
+          <w:szCs w:val="24"/>
+        </w:rPr>
         <w:t>và/hoặc</w:t>
       </w:r>
     </w:p>
@@ -2389,17 +3405,31 @@
         <w:spacing w:before="60" w:after="60" w:line="360" w:lineRule="auto"/>
         <w:ind w:right="0" w:hanging="587"/>
         <w:jc w:val="both"/>
-      </w:pPr>
-      <w:r>
+        <w:rPr>
+          <w:sz w:val="24"/>
+          <w:szCs w:val="24"/>
+        </w:rPr>
+      </w:pPr>
+      <w:r>
+        <w:rPr>
+          <w:sz w:val="24"/>
+          <w:szCs w:val="24"/>
+        </w:rPr>
         <w:t>Thực hiện bất kỳ biện pháp xử lý nào khác theo quy định của pháp</w:t>
       </w:r>
       <w:r>
         <w:rPr>
           <w:spacing w:val="-11"/>
+          <w:sz w:val="24"/>
+          <w:szCs w:val="24"/>
         </w:rPr>
         <w:t xml:space="preserve"> </w:t>
       </w:r>
       <w:r>
+        <w:rPr>
+          <w:sz w:val="24"/>
+          <w:szCs w:val="24"/>
+        </w:rPr>
         <w:t>luật.</w:t>
       </w:r>
     </w:p>
@@ -2415,210 +3445,346 @@
         </w:tabs>
         <w:spacing w:before="60" w:after="60" w:line="360" w:lineRule="auto"/>
         <w:ind w:right="363"/>
-      </w:pPr>
-      <w:r>
-        <w:t xml:space="preserve">Trong trường hợp (i) Bên B “không” khắc phục vi phạm và hoặc không hoàn thành việc khắc phục vi phạm trong vòng ba (03) ngày kể từ thời điểm vi phạm hoặc một thời hạn khác theo thông báo của Bên A hoặc (ii) vi phạm đó là không thể khắc phục được; hoặc (iii) vi phạm đó vẫn tái diễn; hoặc (iv) vi phạm gây ảnh hưởng </w:t>
-      </w:r>
-      <w:r>
-        <w:lastRenderedPageBreak/>
-        <w:t>hoặc có thể gây ảnh hưởng tới hình ảnh, uy tín của Bên A/Chủ Đầu Tư, Dự Án thì Bên A có quyền gửi</w:t>
+        <w:rPr>
+          <w:sz w:val="24"/>
+          <w:szCs w:val="24"/>
+        </w:rPr>
+      </w:pPr>
+      <w:r>
+        <w:rPr>
+          <w:sz w:val="24"/>
+          <w:szCs w:val="24"/>
+        </w:rPr>
+        <w:t>Trong trường hợp (i) Bên B “không” khắc phục vi phạm và hoặc không hoàn thành việc khắc phục vi phạm trong vòng ba (03) ngày kể từ thời điểm vi phạm hoặc một thời hạn khác theo thông báo của Bên A hoặc (ii) vi phạm đó là không thể khắc phục được; hoặc (iii) vi phạm đó vẫn tái diễn; hoặc (iv) vi phạm gây ảnh hưởng hoặc có thể gây ảnh hưởng tới hình ảnh, uy tín của Bên A/Chủ Đầu Tư, Dự Án thì Bên A có quyền gửi</w:t>
       </w:r>
       <w:r>
         <w:rPr>
           <w:spacing w:val="16"/>
+          <w:sz w:val="24"/>
+          <w:szCs w:val="24"/>
         </w:rPr>
         <w:t xml:space="preserve"> </w:t>
       </w:r>
       <w:r>
+        <w:rPr>
+          <w:sz w:val="24"/>
+          <w:szCs w:val="24"/>
+        </w:rPr>
         <w:t>thông</w:t>
       </w:r>
       <w:r>
         <w:rPr>
           <w:spacing w:val="19"/>
+          <w:sz w:val="24"/>
+          <w:szCs w:val="24"/>
         </w:rPr>
         <w:t xml:space="preserve"> </w:t>
       </w:r>
       <w:r>
+        <w:rPr>
+          <w:sz w:val="24"/>
+          <w:szCs w:val="24"/>
+        </w:rPr>
         <w:t>báo</w:t>
       </w:r>
       <w:r>
         <w:rPr>
           <w:spacing w:val="18"/>
+          <w:sz w:val="24"/>
+          <w:szCs w:val="24"/>
         </w:rPr>
         <w:t xml:space="preserve"> </w:t>
       </w:r>
       <w:r>
+        <w:rPr>
+          <w:sz w:val="24"/>
+          <w:szCs w:val="24"/>
+        </w:rPr>
         <w:t>bằng</w:t>
       </w:r>
       <w:r>
         <w:rPr>
           <w:spacing w:val="19"/>
+          <w:sz w:val="24"/>
+          <w:szCs w:val="24"/>
         </w:rPr>
         <w:t xml:space="preserve"> </w:t>
       </w:r>
       <w:r>
+        <w:rPr>
+          <w:sz w:val="24"/>
+          <w:szCs w:val="24"/>
+        </w:rPr>
         <w:t>văn</w:t>
       </w:r>
       <w:r>
         <w:rPr>
           <w:spacing w:val="18"/>
+          <w:sz w:val="24"/>
+          <w:szCs w:val="24"/>
         </w:rPr>
         <w:t xml:space="preserve"> </w:t>
       </w:r>
       <w:r>
+        <w:rPr>
+          <w:sz w:val="24"/>
+          <w:szCs w:val="24"/>
+        </w:rPr>
         <w:t>bản</w:t>
       </w:r>
       <w:r>
         <w:rPr>
           <w:spacing w:val="19"/>
+          <w:sz w:val="24"/>
+          <w:szCs w:val="24"/>
         </w:rPr>
         <w:t xml:space="preserve"> </w:t>
       </w:r>
       <w:r>
+        <w:rPr>
+          <w:sz w:val="24"/>
+          <w:szCs w:val="24"/>
+        </w:rPr>
         <w:t>cho</w:t>
       </w:r>
       <w:r>
         <w:rPr>
           <w:spacing w:val="17"/>
+          <w:sz w:val="24"/>
+          <w:szCs w:val="24"/>
         </w:rPr>
         <w:t xml:space="preserve"> </w:t>
       </w:r>
       <w:r>
+        <w:rPr>
+          <w:sz w:val="24"/>
+          <w:szCs w:val="24"/>
+        </w:rPr>
         <w:t>Bên</w:t>
       </w:r>
       <w:r>
         <w:rPr>
           <w:spacing w:val="18"/>
+          <w:sz w:val="24"/>
+          <w:szCs w:val="24"/>
         </w:rPr>
         <w:t xml:space="preserve"> </w:t>
       </w:r>
       <w:r>
+        <w:rPr>
+          <w:sz w:val="24"/>
+          <w:szCs w:val="24"/>
+        </w:rPr>
         <w:t>B</w:t>
       </w:r>
       <w:r>
         <w:rPr>
           <w:spacing w:val="15"/>
+          <w:sz w:val="24"/>
+          <w:szCs w:val="24"/>
         </w:rPr>
         <w:t xml:space="preserve"> </w:t>
       </w:r>
       <w:r>
+        <w:rPr>
+          <w:sz w:val="24"/>
+          <w:szCs w:val="24"/>
+        </w:rPr>
         <w:t>thông</w:t>
       </w:r>
       <w:r>
         <w:rPr>
           <w:spacing w:val="18"/>
+          <w:sz w:val="24"/>
+          <w:szCs w:val="24"/>
         </w:rPr>
         <w:t xml:space="preserve"> </w:t>
       </w:r>
       <w:r>
+        <w:rPr>
+          <w:sz w:val="24"/>
+          <w:szCs w:val="24"/>
+        </w:rPr>
         <w:t>báo</w:t>
       </w:r>
       <w:r>
         <w:rPr>
           <w:spacing w:val="17"/>
+          <w:sz w:val="24"/>
+          <w:szCs w:val="24"/>
         </w:rPr>
         <w:t xml:space="preserve"> </w:t>
       </w:r>
       <w:r>
+        <w:rPr>
+          <w:sz w:val="24"/>
+          <w:szCs w:val="24"/>
+        </w:rPr>
         <w:t>chấm</w:t>
       </w:r>
       <w:r>
         <w:rPr>
           <w:spacing w:val="17"/>
+          <w:sz w:val="24"/>
+          <w:szCs w:val="24"/>
         </w:rPr>
         <w:t xml:space="preserve"> </w:t>
       </w:r>
       <w:r>
+        <w:rPr>
+          <w:sz w:val="24"/>
+          <w:szCs w:val="24"/>
+        </w:rPr>
         <w:t>dứt</w:t>
       </w:r>
       <w:r>
         <w:rPr>
           <w:spacing w:val="16"/>
+          <w:sz w:val="24"/>
+          <w:szCs w:val="24"/>
         </w:rPr>
         <w:t xml:space="preserve"> </w:t>
       </w:r>
       <w:r>
+        <w:rPr>
+          <w:sz w:val="24"/>
+          <w:szCs w:val="24"/>
+        </w:rPr>
         <w:t>Hợp</w:t>
       </w:r>
       <w:r>
         <w:rPr>
           <w:spacing w:val="16"/>
+          <w:sz w:val="24"/>
+          <w:szCs w:val="24"/>
         </w:rPr>
         <w:t xml:space="preserve"> </w:t>
       </w:r>
       <w:r>
+        <w:rPr>
+          <w:sz w:val="24"/>
+          <w:szCs w:val="24"/>
+        </w:rPr>
         <w:t>Đồng</w:t>
       </w:r>
       <w:r>
         <w:rPr>
           <w:spacing w:val="15"/>
+          <w:sz w:val="24"/>
+          <w:szCs w:val="24"/>
         </w:rPr>
         <w:t xml:space="preserve"> </w:t>
       </w:r>
       <w:r>
+        <w:rPr>
+          <w:sz w:val="24"/>
+          <w:szCs w:val="24"/>
+        </w:rPr>
         <w:t>và</w:t>
       </w:r>
       <w:r>
         <w:rPr>
           <w:spacing w:val="19"/>
+          <w:sz w:val="24"/>
+          <w:szCs w:val="24"/>
         </w:rPr>
         <w:t xml:space="preserve"> </w:t>
       </w:r>
       <w:r>
+        <w:rPr>
+          <w:sz w:val="24"/>
+          <w:szCs w:val="24"/>
+        </w:rPr>
         <w:t>Hợp</w:t>
       </w:r>
       <w:r>
         <w:rPr>
           <w:spacing w:val="16"/>
+          <w:sz w:val="24"/>
+          <w:szCs w:val="24"/>
         </w:rPr>
         <w:t xml:space="preserve"> </w:t>
       </w:r>
       <w:r>
+        <w:rPr>
+          <w:sz w:val="24"/>
+          <w:szCs w:val="24"/>
+        </w:rPr>
         <w:t>Đồng</w:t>
       </w:r>
       <w:r>
         <w:rPr>
           <w:spacing w:val="18"/>
+          <w:sz w:val="24"/>
+          <w:szCs w:val="24"/>
         </w:rPr>
         <w:t xml:space="preserve"> </w:t>
       </w:r>
       <w:r>
+        <w:rPr>
+          <w:sz w:val="24"/>
+          <w:szCs w:val="24"/>
+        </w:rPr>
         <w:t>sẽ</w:t>
       </w:r>
       <w:r>
         <w:rPr>
           <w:spacing w:val="19"/>
+          <w:sz w:val="24"/>
+          <w:szCs w:val="24"/>
         </w:rPr>
         <w:t xml:space="preserve"> </w:t>
       </w:r>
       <w:r>
+        <w:rPr>
+          <w:sz w:val="24"/>
+          <w:szCs w:val="24"/>
+        </w:rPr>
         <w:t>bị</w:t>
       </w:r>
       <w:r>
         <w:rPr>
           <w:spacing w:val="17"/>
+          <w:sz w:val="24"/>
+          <w:szCs w:val="24"/>
         </w:rPr>
         <w:t xml:space="preserve"> </w:t>
       </w:r>
       <w:r>
+        <w:rPr>
+          <w:sz w:val="24"/>
+          <w:szCs w:val="24"/>
+        </w:rPr>
         <w:t>chấm</w:t>
       </w:r>
       <w:r>
         <w:rPr>
           <w:spacing w:val="20"/>
+          <w:sz w:val="24"/>
+          <w:szCs w:val="24"/>
         </w:rPr>
         <w:t xml:space="preserve"> </w:t>
       </w:r>
       <w:r>
+        <w:rPr>
+          <w:sz w:val="24"/>
+          <w:szCs w:val="24"/>
+        </w:rPr>
         <w:t>dứt</w:t>
       </w:r>
       <w:r>
         <w:rPr>
           <w:spacing w:val="16"/>
+          <w:sz w:val="24"/>
+          <w:szCs w:val="24"/>
         </w:rPr>
         <w:t xml:space="preserve"> </w:t>
       </w:r>
       <w:r>
+        <w:rPr>
+          <w:sz w:val="24"/>
+          <w:szCs w:val="24"/>
+        </w:rPr>
         <w:t>sau [05] ngày kể từ ngày Bên A gửi thông báo chấm dứt.</w:t>
       </w:r>
     </w:p>
@@ -2633,17 +3799,31 @@
           <w:tab w:val="left" w:pos="654"/>
         </w:tabs>
         <w:spacing w:before="60" w:after="60" w:line="360" w:lineRule="auto"/>
-      </w:pPr>
-      <w:r>
+        <w:rPr>
+          <w:sz w:val="24"/>
+          <w:szCs w:val="24"/>
+        </w:rPr>
+      </w:pPr>
+      <w:r>
+        <w:rPr>
+          <w:sz w:val="24"/>
+          <w:szCs w:val="24"/>
+        </w:rPr>
         <w:t>Các khoản tiền phạt vi phạm, tiền bồi thường thiệt hại và các khoản phải thanh toán khác mà Bên B phải thanh toán cho Bên A như quy định tại Hợp Đồng này, Bên B có nghĩa vụ thanh toán cho Bên A theo đúng thời hạn thông báo/yêu cầu của Bên A và Bên A (tùy theo quyết định của mình) có quyền khấu trừ từ Tiền Đặt Cọc và/hoặc Phí Dịch vụ môi giới của Bên B theo Hợp Đồng. Nếu Tiền Đặt Cọc và Phí Dịch vụ môi giới của Bên B không đủ để thanh toán các khoản tiền này, Bên B có trách nhiệm thanh toán số tiền còn thiếu theo yêu cầu của Bên A. Trường hợp vi phạm, Bên B phải trả cho Bên A khoản tiền lãi trên số tiền chậm trả tính bằng 0,07%/ngày cho thời gian chậm</w:t>
       </w:r>
       <w:r>
         <w:rPr>
           <w:spacing w:val="-12"/>
+          <w:sz w:val="24"/>
+          <w:szCs w:val="24"/>
         </w:rPr>
         <w:t xml:space="preserve"> </w:t>
       </w:r>
       <w:r>
+        <w:rPr>
+          <w:sz w:val="24"/>
+          <w:szCs w:val="24"/>
+        </w:rPr>
         <w:t>trả.</w:t>
       </w:r>
     </w:p>
@@ -2655,6 +3835,10 @@
         </w:tabs>
         <w:spacing w:before="60" w:after="60" w:line="360" w:lineRule="auto"/>
         <w:ind w:firstLine="0"/>
+        <w:rPr>
+          <w:sz w:val="24"/>
+          <w:szCs w:val="24"/>
+        </w:rPr>
       </w:pPr>
     </w:p>
     <w:p>
@@ -2662,22 +3846,34 @@
         <w:pStyle w:val="Heading1"/>
         <w:spacing w:before="60" w:after="60" w:line="360" w:lineRule="auto"/>
         <w:jc w:val="both"/>
+        <w:rPr>
+          <w:sz w:val="24"/>
+          <w:szCs w:val="24"/>
+        </w:rPr>
       </w:pPr>
       <w:r>
         <w:rPr>
           <w:b w:val="0"/>
           <w:spacing w:val="-56"/>
+          <w:sz w:val="24"/>
+          <w:szCs w:val="24"/>
           <w:u w:val="thick"/>
         </w:rPr>
         <w:t xml:space="preserve"> </w:t>
       </w:r>
       <w:r>
         <w:rPr>
+          <w:sz w:val="24"/>
+          <w:szCs w:val="24"/>
           <w:u w:val="thick"/>
         </w:rPr>
         <w:t>ĐIỀU 6:</w:t>
       </w:r>
       <w:r>
+        <w:rPr>
+          <w:sz w:val="24"/>
+          <w:szCs w:val="24"/>
+        </w:rPr>
         <w:t xml:space="preserve"> THỜI HẠN HỢP ĐỒNG VÀ CHẤM DỨT HỢP ĐỒNG</w:t>
       </w:r>
     </w:p>
@@ -2693,17 +3889,31 @@
         </w:tabs>
         <w:spacing w:before="60" w:after="60" w:line="360" w:lineRule="auto"/>
         <w:ind w:left="720" w:right="0" w:hanging="429"/>
-      </w:pPr>
-      <w:r>
+        <w:rPr>
+          <w:sz w:val="24"/>
+          <w:szCs w:val="24"/>
+        </w:rPr>
+      </w:pPr>
+      <w:r>
+        <w:rPr>
+          <w:sz w:val="24"/>
+          <w:szCs w:val="24"/>
+        </w:rPr>
         <w:t>Hợp Đồng này có hiệu lực trong thời hạn 01 năm kể từ ngày ký Hợp</w:t>
       </w:r>
       <w:r>
         <w:rPr>
           <w:spacing w:val="-8"/>
+          <w:sz w:val="24"/>
+          <w:szCs w:val="24"/>
         </w:rPr>
         <w:t xml:space="preserve"> </w:t>
       </w:r>
       <w:r>
+        <w:rPr>
+          <w:sz w:val="24"/>
+          <w:szCs w:val="24"/>
+        </w:rPr>
         <w:t>đồng.</w:t>
       </w:r>
     </w:p>
@@ -2719,17 +3929,31 @@
         </w:tabs>
         <w:spacing w:before="60" w:after="60" w:line="360" w:lineRule="auto"/>
         <w:ind w:left="720" w:right="0" w:hanging="429"/>
-      </w:pPr>
-      <w:r>
+        <w:rPr>
+          <w:sz w:val="24"/>
+          <w:szCs w:val="24"/>
+        </w:rPr>
+      </w:pPr>
+      <w:r>
+        <w:rPr>
+          <w:sz w:val="24"/>
+          <w:szCs w:val="24"/>
+        </w:rPr>
         <w:t>Hết thời hạn Hợp đồng, nếu hai bên không có ý kiến gì khác thì hợp đồng tự động gia hạn thêm 01</w:t>
       </w:r>
       <w:r>
         <w:rPr>
           <w:spacing w:val="-12"/>
+          <w:sz w:val="24"/>
+          <w:szCs w:val="24"/>
         </w:rPr>
         <w:t xml:space="preserve"> </w:t>
       </w:r>
       <w:r>
+        <w:rPr>
+          <w:sz w:val="24"/>
+          <w:szCs w:val="24"/>
+        </w:rPr>
         <w:t>năm.</w:t>
       </w:r>
     </w:p>
@@ -2745,17 +3969,31 @@
         </w:tabs>
         <w:spacing w:before="60" w:after="60" w:line="360" w:lineRule="auto"/>
         <w:ind w:left="720" w:right="366" w:hanging="429"/>
-      </w:pPr>
-      <w:r>
+        <w:rPr>
+          <w:sz w:val="24"/>
+          <w:szCs w:val="24"/>
+        </w:rPr>
+      </w:pPr>
+      <w:r>
+        <w:rPr>
+          <w:sz w:val="24"/>
+          <w:szCs w:val="24"/>
+        </w:rPr>
         <w:t>Trong trường hợp Hợp Đồng chấm dứt, không ảnh hưởng đến các quyền và biện pháp khắc phục của các Bên, Bên B có nghĩa vụ chuyển cho Bên A tất cả các tài liệu liên quan đến Dự Án và chương trình bán Nhà ở mà Bên B đang giữ hoặc quản lý hoặc sử dụng vì mục đích thực hiện Hợp Đồng này trong vòng 03 ngày kể từ ngày Hợp Đồng chấm dứt. Khi đó, hợp đồng được tự động thanh</w:t>
       </w:r>
       <w:r>
         <w:rPr>
           <w:spacing w:val="-12"/>
+          <w:sz w:val="24"/>
+          <w:szCs w:val="24"/>
         </w:rPr>
         <w:t xml:space="preserve"> </w:t>
       </w:r>
       <w:r>
+        <w:rPr>
+          <w:sz w:val="24"/>
+          <w:szCs w:val="24"/>
+        </w:rPr>
         <w:t>lý.</w:t>
       </w:r>
     </w:p>
@@ -2767,6 +4005,10 @@
         </w:tabs>
         <w:spacing w:before="60" w:after="60" w:line="360" w:lineRule="auto"/>
         <w:ind w:left="720" w:right="366" w:firstLine="0"/>
+        <w:rPr>
+          <w:sz w:val="24"/>
+          <w:szCs w:val="24"/>
+        </w:rPr>
       </w:pPr>
     </w:p>
     <w:p>
@@ -2774,17 +4016,25 @@
         <w:pStyle w:val="Heading1"/>
         <w:spacing w:before="60" w:after="60" w:line="360" w:lineRule="auto"/>
         <w:jc w:val="both"/>
+        <w:rPr>
+          <w:sz w:val="24"/>
+          <w:szCs w:val="24"/>
+        </w:rPr>
       </w:pPr>
       <w:r>
         <w:rPr>
           <w:b w:val="0"/>
           <w:spacing w:val="-56"/>
+          <w:sz w:val="24"/>
+          <w:szCs w:val="24"/>
           <w:u w:val="thick"/>
         </w:rPr>
         <w:t xml:space="preserve"> </w:t>
       </w:r>
       <w:r>
         <w:rPr>
+          <w:sz w:val="24"/>
+          <w:szCs w:val="24"/>
           <w:u w:val="thick"/>
         </w:rPr>
         <w:t>ĐIỀU 7</w:t>
@@ -2792,6 +4042,8 @@
       <w:r>
         <w:rPr>
           <w:b w:val="0"/>
+          <w:sz w:val="24"/>
+          <w:szCs w:val="24"/>
           <w:u w:val="thick"/>
         </w:rPr>
         <w:t>:</w:t>
@@ -2799,10 +4051,16 @@
       <w:r>
         <w:rPr>
           <w:b w:val="0"/>
+          <w:sz w:val="24"/>
+          <w:szCs w:val="24"/>
         </w:rPr>
         <w:t xml:space="preserve"> </w:t>
       </w:r>
       <w:r>
+        <w:rPr>
+          <w:sz w:val="24"/>
+          <w:szCs w:val="24"/>
+        </w:rPr>
         <w:t>BẢO MẬT</w:t>
       </w:r>
     </w:p>
@@ -2813,28 +4071,46 @@
         <w:ind w:left="720" w:right="365"/>
         <w:jc w:val="both"/>
         <w:rPr>
+          <w:sz w:val="24"/>
+          <w:szCs w:val="24"/>
           <w:lang w:val="en-GB"/>
         </w:rPr>
       </w:pPr>
       <w:r>
+        <w:rPr>
+          <w:sz w:val="24"/>
+          <w:szCs w:val="24"/>
+        </w:rPr>
         <w:t xml:space="preserve">Bên B cam kết bảo mật nội dung Hợp Đồng này và các phụ lục đính kèm (nếu có) cũng như bảo mật  những thông tin liên quan đến Khách Hàng trước bên thứ ba bất kỳ, ngoại trừ trường hợp có sự chấp thuận trước bằng văn bản của </w:t>
       </w:r>
       <w:r>
         <w:rPr>
           <w:spacing w:val="-2"/>
+          <w:sz w:val="24"/>
+          <w:szCs w:val="24"/>
         </w:rPr>
         <w:t xml:space="preserve">Bên </w:t>
       </w:r>
       <w:r>
+        <w:rPr>
+          <w:sz w:val="24"/>
+          <w:szCs w:val="24"/>
+        </w:rPr>
         <w:t>A. Điều khoản này vẫn tiếp tục ràng buộc Bên B ngay cả khi Hợp Đồng này đã kết thúc. Trường hợp vi phạm, Bên B có trách nhiệm bồi thường toàn bộ thiệt hại phát</w:t>
       </w:r>
       <w:r>
         <w:rPr>
           <w:spacing w:val="-15"/>
+          <w:sz w:val="24"/>
+          <w:szCs w:val="24"/>
         </w:rPr>
         <w:t xml:space="preserve"> </w:t>
       </w:r>
       <w:r>
+        <w:rPr>
+          <w:sz w:val="24"/>
+          <w:szCs w:val="24"/>
+        </w:rPr>
         <w:t>sinh.</w:t>
       </w:r>
     </w:p>
@@ -2845,6 +4121,8 @@
         <w:ind w:left="720" w:right="365"/>
         <w:jc w:val="both"/>
         <w:rPr>
+          <w:sz w:val="24"/>
+          <w:szCs w:val="24"/>
           <w:lang w:val="en-GB"/>
         </w:rPr>
       </w:pPr>
@@ -2854,27 +4132,41 @@
         <w:pStyle w:val="Heading1"/>
         <w:spacing w:before="60" w:after="60" w:line="360" w:lineRule="auto"/>
         <w:jc w:val="both"/>
+        <w:rPr>
+          <w:sz w:val="24"/>
+          <w:szCs w:val="24"/>
+        </w:rPr>
       </w:pPr>
       <w:r>
         <w:rPr>
           <w:b w:val="0"/>
           <w:spacing w:val="-56"/>
+          <w:sz w:val="24"/>
+          <w:szCs w:val="24"/>
           <w:u w:val="thick"/>
         </w:rPr>
         <w:t xml:space="preserve"> </w:t>
       </w:r>
       <w:r>
         <w:rPr>
+          <w:sz w:val="24"/>
+          <w:szCs w:val="24"/>
           <w:u w:val="thick"/>
         </w:rPr>
         <w:t>ĐIỀU 8:</w:t>
       </w:r>
       <w:r>
+        <w:rPr>
+          <w:sz w:val="24"/>
+          <w:szCs w:val="24"/>
+        </w:rPr>
         <w:t xml:space="preserve"> THÔNG BÁO VÀ THƯ TỪ GIAO</w:t>
       </w:r>
       <w:r>
         <w:rPr>
           <w:spacing w:val="-3"/>
+          <w:sz w:val="24"/>
+          <w:szCs w:val="24"/>
         </w:rPr>
         <w:t xml:space="preserve"> DỊCH</w:t>
       </w:r>
@@ -2891,17 +4183,31 @@
         </w:tabs>
         <w:spacing w:before="60" w:after="60" w:line="360" w:lineRule="auto"/>
         <w:ind w:left="720" w:right="363" w:hanging="428"/>
-      </w:pPr>
-      <w:r>
+        <w:rPr>
+          <w:sz w:val="24"/>
+          <w:szCs w:val="24"/>
+        </w:rPr>
+      </w:pPr>
+      <w:r>
+        <w:rPr>
+          <w:sz w:val="24"/>
+          <w:szCs w:val="24"/>
+        </w:rPr>
         <w:t>Mọi thông báo, đề nghị, yêu cầu thanh toán hoặc thư từ giao dịch, v.v... do một Bên gửi cho Bên kia sẽ phải lập thành văn bản (bao gồm cả thư điện tử) và được gửi theo địa chỉ liên hệ nêu tại phần đầu của Hợp Đồng, trừ khi có thay đổi theo thông báo trước của Bên liên</w:t>
       </w:r>
       <w:r>
         <w:rPr>
           <w:spacing w:val="-12"/>
+          <w:sz w:val="24"/>
+          <w:szCs w:val="24"/>
         </w:rPr>
         <w:t xml:space="preserve"> </w:t>
       </w:r>
       <w:r>
+        <w:rPr>
+          <w:sz w:val="24"/>
+          <w:szCs w:val="24"/>
+        </w:rPr>
         <w:t xml:space="preserve">quan. </w:t>
       </w:r>
     </w:p>
@@ -2917,17 +4223,31 @@
         </w:tabs>
         <w:spacing w:before="60" w:after="60" w:line="360" w:lineRule="auto"/>
         <w:ind w:left="720" w:right="363" w:hanging="428"/>
-      </w:pPr>
-      <w:r>
+        <w:rPr>
+          <w:sz w:val="24"/>
+          <w:szCs w:val="24"/>
+        </w:rPr>
+      </w:pPr>
+      <w:r>
+        <w:rPr>
+          <w:sz w:val="24"/>
+          <w:szCs w:val="24"/>
+        </w:rPr>
         <w:t>Mọi thông báo, đề nghị, yêu cầu thanh toán hoặc thư từ giao dịch v.v... do một Bên gửi cho Bên kia theo Hợp Đồng sẽ được xem như Bên kia đã nhận được: (i) vào ngày bên gửi nhận được bằng chứng xác nhận chuyển fax theo thông lệ trong trường hợp chuyển bằng fax; hoặc (ii) vào ngày thứ hai tính từ ngày gửi bưu điện trong trường họp gửi bằng thư bảo đảm; hoặc (iii) vào thời điểm thông báo, đề nghị, yêu cầu thanh toán hoặc thư từ giao dịch v.v... đó được nhập vào hệ thống thông tin do Bên B đăng ký hợp lệ trong Hợp Đồng (khi Bên A gửi cho Bên B) hoặc do Bên A chỉ định/cung cấp hợp lệ (khi Bên A gửi cho Bên B) trong  trường hợp gửi bằng thư điện tử. Trong các trường hợp này, nếu ngày tương ứng rơi vào ngày chủ nhật hoặc ngày lễ của Việt Nam thì các thông báo, yêu cầu, khiếu nại hoặc thư từ giao dịch v.v... nói trên sẽ được xem như Bên kia nhận được vào ngày kế</w:t>
       </w:r>
       <w:r>
         <w:rPr>
           <w:spacing w:val="-6"/>
+          <w:sz w:val="24"/>
+          <w:szCs w:val="24"/>
         </w:rPr>
         <w:t xml:space="preserve"> </w:t>
       </w:r>
       <w:r>
+        <w:rPr>
+          <w:sz w:val="24"/>
+          <w:szCs w:val="24"/>
+        </w:rPr>
         <w:t>tiếp.</w:t>
       </w:r>
     </w:p>
@@ -2939,6 +4259,10 @@
         </w:tabs>
         <w:spacing w:before="60" w:after="60" w:line="360" w:lineRule="auto"/>
         <w:ind w:left="720" w:right="363" w:firstLine="0"/>
+        <w:rPr>
+          <w:sz w:val="24"/>
+          <w:szCs w:val="24"/>
+        </w:rPr>
       </w:pPr>
     </w:p>
     <w:p>
@@ -2946,22 +4270,34 @@
         <w:pStyle w:val="Heading1"/>
         <w:spacing w:before="60" w:after="60" w:line="360" w:lineRule="auto"/>
         <w:jc w:val="both"/>
+        <w:rPr>
+          <w:sz w:val="24"/>
+          <w:szCs w:val="24"/>
+        </w:rPr>
       </w:pPr>
       <w:r>
         <w:rPr>
           <w:b w:val="0"/>
           <w:spacing w:val="-56"/>
+          <w:sz w:val="24"/>
+          <w:szCs w:val="24"/>
           <w:u w:val="thick"/>
         </w:rPr>
         <w:t xml:space="preserve"> </w:t>
       </w:r>
       <w:r>
         <w:rPr>
+          <w:sz w:val="24"/>
+          <w:szCs w:val="24"/>
           <w:u w:val="thick"/>
         </w:rPr>
         <w:t xml:space="preserve">ĐIỀU 9. </w:t>
       </w:r>
       <w:r>
+        <w:rPr>
+          <w:sz w:val="24"/>
+          <w:szCs w:val="24"/>
+        </w:rPr>
         <w:t>ĐIỀU KHOẢN CHUNG</w:t>
       </w:r>
     </w:p>
@@ -2977,17 +4313,31 @@
         </w:tabs>
         <w:spacing w:before="60" w:after="60" w:line="360" w:lineRule="auto"/>
         <w:ind w:left="720" w:right="366" w:hanging="428"/>
-      </w:pPr>
-      <w:r>
+        <w:rPr>
+          <w:sz w:val="24"/>
+          <w:szCs w:val="24"/>
+        </w:rPr>
+      </w:pPr>
+      <w:r>
+        <w:rPr>
+          <w:sz w:val="24"/>
+          <w:szCs w:val="24"/>
+        </w:rPr>
         <w:t>Hợp Đồng này được giải thích và hiểu theo pháp luật Việt Nam. Hai Bên cam kết thực hiện đầy đủ, kịp thời và có hiệu quả các điều khoản đã thoả thuận và cam kết trong Hợp Đồng</w:t>
       </w:r>
       <w:r>
         <w:rPr>
           <w:spacing w:val="-14"/>
+          <w:sz w:val="24"/>
+          <w:szCs w:val="24"/>
         </w:rPr>
         <w:t xml:space="preserve"> </w:t>
       </w:r>
       <w:r>
+        <w:rPr>
+          <w:sz w:val="24"/>
+          <w:szCs w:val="24"/>
+        </w:rPr>
         <w:t>này.</w:t>
       </w:r>
     </w:p>
@@ -3003,17 +4353,31 @@
         </w:tabs>
         <w:spacing w:before="60" w:after="60" w:line="360" w:lineRule="auto"/>
         <w:ind w:left="720" w:right="367" w:hanging="428"/>
-      </w:pPr>
-      <w:r>
+        <w:rPr>
+          <w:sz w:val="24"/>
+          <w:szCs w:val="24"/>
+        </w:rPr>
+      </w:pPr>
+      <w:r>
+        <w:rPr>
+          <w:sz w:val="24"/>
+          <w:szCs w:val="24"/>
+        </w:rPr>
         <w:t>Trong quá trình thực hiện Hợp Đồng, nếu có phát sinh tranh chấp, Hai Bên cùng bàn bạc, thỏa thuận giải quyết trên tinh thần hợp tác. Thời hạn thương lượng là 30 (ba mươi) ngày kể từ ngày một Bên nhận được yêu cầu giải quyết tranh chấp của Bên kia. Nếu quá thời hạn thương lượng nêu tại Điều này mà Hai Bên không tự giải quyết được thì một trong các Bên có quyền đưa tranh chấp ra giải quyết tại Tòa án có thẩm quyền theo quy định của pháp</w:t>
       </w:r>
       <w:r>
         <w:rPr>
           <w:spacing w:val="-3"/>
+          <w:sz w:val="24"/>
+          <w:szCs w:val="24"/>
         </w:rPr>
         <w:t xml:space="preserve"> </w:t>
       </w:r>
       <w:r>
+        <w:rPr>
+          <w:sz w:val="24"/>
+          <w:szCs w:val="24"/>
+        </w:rPr>
         <w:t>luật.</w:t>
       </w:r>
     </w:p>
@@ -3029,17 +4393,31 @@
         </w:tabs>
         <w:spacing w:before="60" w:after="60" w:line="360" w:lineRule="auto"/>
         <w:ind w:left="720" w:right="366" w:hanging="428"/>
-      </w:pPr>
-      <w:r>
+        <w:rPr>
+          <w:sz w:val="24"/>
+          <w:szCs w:val="24"/>
+        </w:rPr>
+      </w:pPr>
+      <w:r>
+        <w:rPr>
+          <w:sz w:val="24"/>
+          <w:szCs w:val="24"/>
+        </w:rPr>
         <w:t>Mọi sửa đổi, bổ sung Hợp Đồng phải được hai Bên thỏa thuận bằng văn bản và phải được ký hợp lệ bởi Các Bên, trừ trường họp Hợp Đồng có quy định</w:t>
       </w:r>
       <w:r>
         <w:rPr>
           <w:spacing w:val="-1"/>
+          <w:sz w:val="24"/>
+          <w:szCs w:val="24"/>
         </w:rPr>
         <w:t xml:space="preserve"> </w:t>
       </w:r>
       <w:r>
+        <w:rPr>
+          <w:sz w:val="24"/>
+          <w:szCs w:val="24"/>
+        </w:rPr>
         <w:t>khác.</w:t>
       </w:r>
     </w:p>
@@ -3055,17 +4433,31 @@
         </w:tabs>
         <w:spacing w:before="60" w:after="60" w:line="360" w:lineRule="auto"/>
         <w:ind w:left="720" w:hanging="428"/>
-      </w:pPr>
-      <w:r>
+        <w:rPr>
+          <w:sz w:val="24"/>
+          <w:szCs w:val="24"/>
+        </w:rPr>
+      </w:pPr>
+      <w:r>
+        <w:rPr>
+          <w:sz w:val="24"/>
+          <w:szCs w:val="24"/>
+        </w:rPr>
         <w:t>Hợp Đồng này có hiệu lực kể từ ngày ký và đươc lập thành 02 (hai) bản gốc bằng Tiếng Việt có giá trị pháp lý như nhau. Bên A giữ 01 (một) bản, Bên B giữ 01 (một)</w:t>
       </w:r>
       <w:r>
         <w:rPr>
           <w:spacing w:val="-11"/>
+          <w:sz w:val="24"/>
+          <w:szCs w:val="24"/>
         </w:rPr>
         <w:t xml:space="preserve"> </w:t>
       </w:r>
       <w:r>
+        <w:rPr>
+          <w:sz w:val="24"/>
+          <w:szCs w:val="24"/>
+        </w:rPr>
         <w:t>bản.</w:t>
       </w:r>
     </w:p>
@@ -3112,11 +4504,15 @@
               <w:jc w:val="center"/>
               <w:rPr>
                 <w:b/>
+                <w:sz w:val="24"/>
+                <w:szCs w:val="24"/>
               </w:rPr>
             </w:pPr>
             <w:r>
               <w:rPr>
                 <w:b/>
+                <w:sz w:val="24"/>
+                <w:szCs w:val="24"/>
               </w:rPr>
               <w:t>BÊN B</w:t>
             </w:r>
@@ -3134,11 +4530,15 @@
               <w:ind w:left="1940"/>
               <w:rPr>
                 <w:b/>
+                <w:sz w:val="24"/>
+                <w:szCs w:val="24"/>
               </w:rPr>
             </w:pPr>
             <w:r>
               <w:rPr>
                 <w:b/>
+                <w:sz w:val="24"/>
+                <w:szCs w:val="24"/>
               </w:rPr>
               <w:t>ĐẠI DIỆN BÊN A</w:t>
             </w:r>
@@ -3162,6 +4562,8 @@
               <w:ind w:left="200"/>
               <w:rPr>
                 <w:b/>
+                <w:sz w:val="24"/>
+                <w:szCs w:val="24"/>
                 <w:lang w:val="en-GB"/>
               </w:rPr>
             </w:pPr>
@@ -3173,6 +4575,8 @@
               <w:ind w:left="200"/>
               <w:rPr>
                 <w:b/>
+                <w:sz w:val="24"/>
+                <w:szCs w:val="24"/>
                 <w:lang w:val="en-GB"/>
               </w:rPr>
             </w:pPr>
@@ -3184,6 +4588,8 @@
               <w:ind w:left="200"/>
               <w:rPr>
                 <w:b/>
+                <w:sz w:val="24"/>
+                <w:szCs w:val="24"/>
                 <w:lang w:val="en-GB"/>
               </w:rPr>
             </w:pPr>
@@ -3195,6 +4601,8 @@
               <w:ind w:left="200"/>
               <w:rPr>
                 <w:b/>
+                <w:sz w:val="24"/>
+                <w:szCs w:val="24"/>
                 <w:lang w:val="en-GB"/>
               </w:rPr>
             </w:pPr>
@@ -3206,6 +4614,8 @@
               <w:ind w:left="200"/>
               <w:rPr>
                 <w:b/>
+                <w:sz w:val="24"/>
+                <w:szCs w:val="24"/>
                 <w:lang w:val="en-GB"/>
               </w:rPr>
             </w:pPr>
@@ -3217,6 +4627,8 @@
               <w:ind w:left="200"/>
               <w:rPr>
                 <w:b/>
+                <w:sz w:val="24"/>
+                <w:szCs w:val="24"/>
                 <w:lang w:val="en-GB"/>
               </w:rPr>
             </w:pPr>
@@ -3228,6 +4640,8 @@
               <w:ind w:left="200"/>
               <w:rPr>
                 <w:b/>
+                <w:sz w:val="24"/>
+                <w:szCs w:val="24"/>
                 <w:lang w:val="en-GB"/>
               </w:rPr>
             </w:pPr>
@@ -3244,6 +4658,8 @@
               <w:spacing w:line="225" w:lineRule="exact"/>
               <w:rPr>
                 <w:b/>
+                <w:sz w:val="24"/>
+                <w:szCs w:val="24"/>
                 <w:lang w:val="en-GB"/>
               </w:rPr>
             </w:pPr>
@@ -3255,6 +4671,8 @@
               <w:ind w:left="1940"/>
               <w:rPr>
                 <w:b/>
+                <w:sz w:val="24"/>
+                <w:szCs w:val="24"/>
                 <w:lang w:val="en-GB"/>
               </w:rPr>
             </w:pPr>
@@ -3266,6 +4684,8 @@
               <w:ind w:left="1940"/>
               <w:rPr>
                 <w:b/>
+                <w:sz w:val="24"/>
+                <w:szCs w:val="24"/>
                 <w:lang w:val="en-GB"/>
               </w:rPr>
             </w:pPr>
@@ -3277,6 +4697,8 @@
               <w:ind w:left="1940"/>
               <w:rPr>
                 <w:b/>
+                <w:sz w:val="24"/>
+                <w:szCs w:val="24"/>
                 <w:lang w:val="en-GB"/>
               </w:rPr>
             </w:pPr>
@@ -3288,6 +4710,8 @@
               <w:ind w:left="1940"/>
               <w:rPr>
                 <w:b/>
+                <w:sz w:val="24"/>
+                <w:szCs w:val="24"/>
                 <w:lang w:val="en-GB"/>
               </w:rPr>
             </w:pPr>
@@ -3299,12 +4723,16 @@
               <w:ind w:left="1940"/>
               <w:rPr>
                 <w:b/>
+                <w:sz w:val="24"/>
+                <w:szCs w:val="24"/>
                 <w:lang w:val="en-GB"/>
               </w:rPr>
             </w:pPr>
             <w:r>
               <w:rPr>
                 <w:b/>
+                <w:sz w:val="24"/>
+                <w:szCs w:val="24"/>
                 <w:lang w:val="en-GB"/>
               </w:rPr>
               <w:t>Mai Hoài Thương</w:t>
@@ -3338,8 +4766,16 @@
         <w:spacing w:before="72"/>
         <w:ind w:left="0" w:right="74"/>
         <w:jc w:val="center"/>
-      </w:pPr>
-      <w:r>
+        <w:rPr>
+          <w:sz w:val="24"/>
+          <w:szCs w:val="24"/>
+        </w:rPr>
+      </w:pPr>
+      <w:r>
+        <w:rPr>
+          <w:sz w:val="24"/>
+          <w:szCs w:val="24"/>
+        </w:rPr>
         <w:lastRenderedPageBreak/>
         <w:t>PHỤ LỤC 01 – VI PHẠM CỦA BÊN B VÀ HÌNH THỨC XỬ LÝ</w:t>
       </w:r>
@@ -3347,7 +4783,7 @@
     <w:p>
       <w:pPr>
         <w:spacing w:before="100"/>
-        <w:ind w:left="1978"/>
+        <w:jc w:val="center"/>
         <w:rPr>
           <w:i/>
         </w:rPr>
@@ -5615,11 +7051,15 @@
               <w:jc w:val="center"/>
               <w:rPr>
                 <w:b/>
+                <w:sz w:val="24"/>
+                <w:szCs w:val="24"/>
               </w:rPr>
             </w:pPr>
             <w:r>
               <w:rPr>
                 <w:b/>
+                <w:sz w:val="24"/>
+                <w:szCs w:val="24"/>
               </w:rPr>
               <w:t>BÊN B</w:t>
             </w:r>
@@ -5637,11 +7077,15 @@
               <w:ind w:left="1940"/>
               <w:rPr>
                 <w:b/>
+                <w:sz w:val="24"/>
+                <w:szCs w:val="24"/>
               </w:rPr>
             </w:pPr>
             <w:r>
               <w:rPr>
                 <w:b/>
+                <w:sz w:val="24"/>
+                <w:szCs w:val="24"/>
               </w:rPr>
               <w:t>ĐẠI DIỆN BÊN A</w:t>
             </w:r>
@@ -5665,6 +7109,8 @@
               <w:ind w:left="200"/>
               <w:rPr>
                 <w:b/>
+                <w:sz w:val="24"/>
+                <w:szCs w:val="24"/>
                 <w:lang w:val="en-GB"/>
               </w:rPr>
             </w:pPr>
@@ -5676,6 +7122,8 @@
               <w:ind w:left="200"/>
               <w:rPr>
                 <w:b/>
+                <w:sz w:val="24"/>
+                <w:szCs w:val="24"/>
                 <w:lang w:val="en-GB"/>
               </w:rPr>
             </w:pPr>
@@ -5687,6 +7135,8 @@
               <w:ind w:left="200"/>
               <w:rPr>
                 <w:b/>
+                <w:sz w:val="24"/>
+                <w:szCs w:val="24"/>
                 <w:lang w:val="en-GB"/>
               </w:rPr>
             </w:pPr>
@@ -5698,6 +7148,8 @@
               <w:ind w:left="200"/>
               <w:rPr>
                 <w:b/>
+                <w:sz w:val="24"/>
+                <w:szCs w:val="24"/>
                 <w:lang w:val="en-GB"/>
               </w:rPr>
             </w:pPr>
@@ -5709,6 +7161,8 @@
               <w:ind w:left="200"/>
               <w:rPr>
                 <w:b/>
+                <w:sz w:val="24"/>
+                <w:szCs w:val="24"/>
                 <w:lang w:val="en-GB"/>
               </w:rPr>
             </w:pPr>
@@ -5720,6 +7174,8 @@
               <w:ind w:left="200"/>
               <w:rPr>
                 <w:b/>
+                <w:sz w:val="24"/>
+                <w:szCs w:val="24"/>
                 <w:lang w:val="en-GB"/>
               </w:rPr>
             </w:pPr>
@@ -5731,6 +7187,8 @@
               <w:ind w:left="200"/>
               <w:rPr>
                 <w:b/>
+                <w:sz w:val="24"/>
+                <w:szCs w:val="24"/>
                 <w:lang w:val="en-GB"/>
               </w:rPr>
             </w:pPr>
@@ -5748,6 +7206,8 @@
               <w:ind w:left="1940"/>
               <w:rPr>
                 <w:b/>
+                <w:sz w:val="24"/>
+                <w:szCs w:val="24"/>
                 <w:lang w:val="en-GB"/>
               </w:rPr>
             </w:pPr>
@@ -5759,6 +7219,8 @@
               <w:ind w:left="1940"/>
               <w:rPr>
                 <w:b/>
+                <w:sz w:val="24"/>
+                <w:szCs w:val="24"/>
                 <w:lang w:val="en-GB"/>
               </w:rPr>
             </w:pPr>
@@ -5770,6 +7232,8 @@
               <w:ind w:left="1940"/>
               <w:rPr>
                 <w:b/>
+                <w:sz w:val="24"/>
+                <w:szCs w:val="24"/>
                 <w:lang w:val="en-GB"/>
               </w:rPr>
             </w:pPr>
@@ -5781,6 +7245,8 @@
               <w:ind w:left="1940"/>
               <w:rPr>
                 <w:b/>
+                <w:sz w:val="24"/>
+                <w:szCs w:val="24"/>
                 <w:lang w:val="en-GB"/>
               </w:rPr>
             </w:pPr>
@@ -5792,6 +7258,8 @@
               <w:ind w:left="1940"/>
               <w:rPr>
                 <w:b/>
+                <w:sz w:val="24"/>
+                <w:szCs w:val="24"/>
                 <w:lang w:val="en-GB"/>
               </w:rPr>
             </w:pPr>
@@ -5803,6 +7271,8 @@
               <w:ind w:left="1940"/>
               <w:rPr>
                 <w:b/>
+                <w:sz w:val="24"/>
+                <w:szCs w:val="24"/>
                 <w:lang w:val="en-GB"/>
               </w:rPr>
             </w:pPr>
@@ -5814,6 +7284,8 @@
               <w:ind w:left="1940"/>
               <w:rPr>
                 <w:b/>
+                <w:sz w:val="24"/>
+                <w:szCs w:val="24"/>
                 <w:lang w:val="en-GB"/>
               </w:rPr>
             </w:pPr>
@@ -5825,6 +7297,8 @@
               <w:ind w:left="1940"/>
               <w:rPr>
                 <w:b/>
+                <w:sz w:val="24"/>
+                <w:szCs w:val="24"/>
                 <w:lang w:val="en-GB"/>
               </w:rPr>
             </w:pPr>
@@ -5836,12 +7310,16 @@
               <w:ind w:left="1940"/>
               <w:rPr>
                 <w:b/>
+                <w:sz w:val="24"/>
+                <w:szCs w:val="24"/>
                 <w:lang w:val="en-GB"/>
               </w:rPr>
             </w:pPr>
             <w:r>
               <w:rPr>
                 <w:b/>
+                <w:sz w:val="24"/>
+                <w:szCs w:val="24"/>
                 <w:lang w:val="en-GB"/>
               </w:rPr>
               <w:t>Mai Hoài Thương</w:t>
@@ -5869,8 +7347,16 @@
         <w:spacing w:before="77"/>
         <w:ind w:left="0"/>
         <w:jc w:val="center"/>
-      </w:pPr>
-      <w:r>
+        <w:rPr>
+          <w:sz w:val="24"/>
+          <w:szCs w:val="24"/>
+        </w:rPr>
+      </w:pPr>
+      <w:r>
+        <w:rPr>
+          <w:sz w:val="24"/>
+          <w:szCs w:val="24"/>
+        </w:rPr>
         <w:lastRenderedPageBreak/>
         <w:t>PHỤ LỤC 02 – BIÊN BẢN XÁC NHẬN THANH TOÁN PHÍ DỊCH VỤ MÔI GIỚI SỐ 0...</w:t>
       </w:r>
@@ -5881,7 +7367,7 @@
           <w:tab w:val="left" w:pos="6853"/>
         </w:tabs>
         <w:spacing w:before="102"/>
-        <w:ind w:left="2198"/>
+        <w:jc w:val="center"/>
         <w:rPr>
           <w:i/>
         </w:rPr>
@@ -7374,11 +8860,15 @@
               <w:ind w:left="200"/>
               <w:rPr>
                 <w:b/>
+                <w:sz w:val="24"/>
+                <w:szCs w:val="24"/>
               </w:rPr>
             </w:pPr>
             <w:r>
               <w:rPr>
                 <w:b/>
+                <w:sz w:val="24"/>
+                <w:szCs w:val="24"/>
               </w:rPr>
               <w:t>BÊN B</w:t>
             </w:r>
@@ -7395,11 +8885,15 @@
               <w:ind w:left="1940"/>
               <w:rPr>
                 <w:b/>
+                <w:sz w:val="24"/>
+                <w:szCs w:val="24"/>
               </w:rPr>
             </w:pPr>
             <w:r>
               <w:rPr>
                 <w:b/>
+                <w:sz w:val="24"/>
+                <w:szCs w:val="24"/>
               </w:rPr>
               <w:t>ĐẠI DIỆN BÊN A</w:t>
             </w:r>

</xml_diff>